<commit_message>
Add Task and Comment models with admin registration
</commit_message>
<xml_diff>
--- a/Lookup.docx
+++ b/Lookup.docx
@@ -333,6 +333,399 @@
         </w:drawing>
       </w:r>
     </w:p>
+    <w:p>
+      <w:r>
+        <w:lastRenderedPageBreak/>
+        <w:drawing>
+          <wp:inline distT="0" distB="0" distL="0" distR="0" wp14:anchorId="09504940" wp14:editId="4485CF45">
+            <wp:extent cx="2984500" cy="1997000"/>
+            <wp:effectExtent l="0" t="0" r="6350" b="3810"/>
+            <wp:docPr id="1252803597" name="Picture 1"/>
+            <wp:cNvGraphicFramePr>
+              <a:graphicFrameLocks xmlns:a="http://schemas.openxmlformats.org/drawingml/2006/main" noChangeAspect="1"/>
+            </wp:cNvGraphicFramePr>
+            <a:graphic xmlns:a="http://schemas.openxmlformats.org/drawingml/2006/main">
+              <a:graphicData uri="http://schemas.openxmlformats.org/drawingml/2006/picture">
+                <pic:pic xmlns:pic="http://schemas.openxmlformats.org/drawingml/2006/picture">
+                  <pic:nvPicPr>
+                    <pic:cNvPr id="1252803597" name=""/>
+                    <pic:cNvPicPr/>
+                  </pic:nvPicPr>
+                  <pic:blipFill>
+                    <a:blip r:embed="rId11"/>
+                    <a:stretch>
+                      <a:fillRect/>
+                    </a:stretch>
+                  </pic:blipFill>
+                  <pic:spPr>
+                    <a:xfrm>
+                      <a:off x="0" y="0"/>
+                      <a:ext cx="3042035" cy="2035498"/>
+                    </a:xfrm>
+                    <a:prstGeom prst="rect">
+                      <a:avLst/>
+                    </a:prstGeom>
+                  </pic:spPr>
+                </pic:pic>
+              </a:graphicData>
+            </a:graphic>
+          </wp:inline>
+        </w:drawing>
+      </w:r>
+      <w:r>
+        <w:drawing>
+          <wp:inline distT="0" distB="0" distL="0" distR="0" wp14:anchorId="7CB6906F" wp14:editId="6487678C">
+            <wp:extent cx="2540000" cy="2140276"/>
+            <wp:effectExtent l="0" t="0" r="0" b="0"/>
+            <wp:docPr id="377263228" name="Picture 1"/>
+            <wp:cNvGraphicFramePr>
+              <a:graphicFrameLocks xmlns:a="http://schemas.openxmlformats.org/drawingml/2006/main" noChangeAspect="1"/>
+            </wp:cNvGraphicFramePr>
+            <a:graphic xmlns:a="http://schemas.openxmlformats.org/drawingml/2006/main">
+              <a:graphicData uri="http://schemas.openxmlformats.org/drawingml/2006/picture">
+                <pic:pic xmlns:pic="http://schemas.openxmlformats.org/drawingml/2006/picture">
+                  <pic:nvPicPr>
+                    <pic:cNvPr id="377263228" name=""/>
+                    <pic:cNvPicPr/>
+                  </pic:nvPicPr>
+                  <pic:blipFill>
+                    <a:blip r:embed="rId12"/>
+                    <a:stretch>
+                      <a:fillRect/>
+                    </a:stretch>
+                  </pic:blipFill>
+                  <pic:spPr>
+                    <a:xfrm>
+                      <a:off x="0" y="0"/>
+                      <a:ext cx="2561548" cy="2158433"/>
+                    </a:xfrm>
+                    <a:prstGeom prst="rect">
+                      <a:avLst/>
+                    </a:prstGeom>
+                  </pic:spPr>
+                </pic:pic>
+              </a:graphicData>
+            </a:graphic>
+          </wp:inline>
+        </w:drawing>
+      </w:r>
+    </w:p>
+    <w:p>
+      <w:r>
+        <w:t>-------------------------------------------------------------------------------------------------------------------</w:t>
+      </w:r>
+    </w:p>
+    <w:p>
+      <w:pPr>
+        <w:pBdr>
+          <w:bottom w:val="single" w:sz="6" w:space="1" w:color="auto"/>
+        </w:pBdr>
+      </w:pPr>
+      <w:r>
+        <w:drawing>
+          <wp:inline distT="0" distB="0" distL="0" distR="0" wp14:anchorId="48690DA8" wp14:editId="6E5323D6">
+            <wp:extent cx="2641600" cy="1735102"/>
+            <wp:effectExtent l="0" t="0" r="6350" b="0"/>
+            <wp:docPr id="1213129769" name="Picture 1"/>
+            <wp:cNvGraphicFramePr>
+              <a:graphicFrameLocks xmlns:a="http://schemas.openxmlformats.org/drawingml/2006/main" noChangeAspect="1"/>
+            </wp:cNvGraphicFramePr>
+            <a:graphic xmlns:a="http://schemas.openxmlformats.org/drawingml/2006/main">
+              <a:graphicData uri="http://schemas.openxmlformats.org/drawingml/2006/picture">
+                <pic:pic xmlns:pic="http://schemas.openxmlformats.org/drawingml/2006/picture">
+                  <pic:nvPicPr>
+                    <pic:cNvPr id="1213129769" name=""/>
+                    <pic:cNvPicPr/>
+                  </pic:nvPicPr>
+                  <pic:blipFill>
+                    <a:blip r:embed="rId13"/>
+                    <a:stretch>
+                      <a:fillRect/>
+                    </a:stretch>
+                  </pic:blipFill>
+                  <pic:spPr>
+                    <a:xfrm>
+                      <a:off x="0" y="0"/>
+                      <a:ext cx="2654666" cy="1743684"/>
+                    </a:xfrm>
+                    <a:prstGeom prst="rect">
+                      <a:avLst/>
+                    </a:prstGeom>
+                  </pic:spPr>
+                </pic:pic>
+              </a:graphicData>
+            </a:graphic>
+          </wp:inline>
+        </w:drawing>
+      </w:r>
+      <w:r>
+        <w:drawing>
+          <wp:inline distT="0" distB="0" distL="0" distR="0" wp14:anchorId="721F29A2" wp14:editId="17A48D2B">
+            <wp:extent cx="1333500" cy="1425239"/>
+            <wp:effectExtent l="0" t="0" r="0" b="3810"/>
+            <wp:docPr id="1947661127" name="Picture 1"/>
+            <wp:cNvGraphicFramePr>
+              <a:graphicFrameLocks xmlns:a="http://schemas.openxmlformats.org/drawingml/2006/main" noChangeAspect="1"/>
+            </wp:cNvGraphicFramePr>
+            <a:graphic xmlns:a="http://schemas.openxmlformats.org/drawingml/2006/main">
+              <a:graphicData uri="http://schemas.openxmlformats.org/drawingml/2006/picture">
+                <pic:pic xmlns:pic="http://schemas.openxmlformats.org/drawingml/2006/picture">
+                  <pic:nvPicPr>
+                    <pic:cNvPr id="1947661127" name=""/>
+                    <pic:cNvPicPr/>
+                  </pic:nvPicPr>
+                  <pic:blipFill>
+                    <a:blip r:embed="rId14"/>
+                    <a:stretch>
+                      <a:fillRect/>
+                    </a:stretch>
+                  </pic:blipFill>
+                  <pic:spPr>
+                    <a:xfrm flipV="1">
+                      <a:off x="0" y="0"/>
+                      <a:ext cx="1349089" cy="1441900"/>
+                    </a:xfrm>
+                    <a:prstGeom prst="rect">
+                      <a:avLst/>
+                    </a:prstGeom>
+                  </pic:spPr>
+                </pic:pic>
+              </a:graphicData>
+            </a:graphic>
+          </wp:inline>
+        </w:drawing>
+      </w:r>
+      <w:r>
+        <w:drawing>
+          <wp:inline distT="0" distB="0" distL="0" distR="0" wp14:anchorId="562ACC8A" wp14:editId="1036698C">
+            <wp:extent cx="1778000" cy="1044164"/>
+            <wp:effectExtent l="0" t="0" r="0" b="3810"/>
+            <wp:docPr id="485017394" name="Picture 1"/>
+            <wp:cNvGraphicFramePr>
+              <a:graphicFrameLocks xmlns:a="http://schemas.openxmlformats.org/drawingml/2006/main" noChangeAspect="1"/>
+            </wp:cNvGraphicFramePr>
+            <a:graphic xmlns:a="http://schemas.openxmlformats.org/drawingml/2006/main">
+              <a:graphicData uri="http://schemas.openxmlformats.org/drawingml/2006/picture">
+                <pic:pic xmlns:pic="http://schemas.openxmlformats.org/drawingml/2006/picture">
+                  <pic:nvPicPr>
+                    <pic:cNvPr id="485017394" name=""/>
+                    <pic:cNvPicPr/>
+                  </pic:nvPicPr>
+                  <pic:blipFill>
+                    <a:blip r:embed="rId15"/>
+                    <a:stretch>
+                      <a:fillRect/>
+                    </a:stretch>
+                  </pic:blipFill>
+                  <pic:spPr>
+                    <a:xfrm>
+                      <a:off x="0" y="0"/>
+                      <a:ext cx="1790128" cy="1051287"/>
+                    </a:xfrm>
+                    <a:prstGeom prst="rect">
+                      <a:avLst/>
+                    </a:prstGeom>
+                  </pic:spPr>
+                </pic:pic>
+              </a:graphicData>
+            </a:graphic>
+          </wp:inline>
+        </w:drawing>
+      </w:r>
+    </w:p>
+    <w:p>
+      <w:r>
+        <w:drawing>
+          <wp:inline distT="0" distB="0" distL="0" distR="0" wp14:anchorId="1E52AAE2" wp14:editId="5F50189D">
+            <wp:extent cx="2559538" cy="1663700"/>
+            <wp:effectExtent l="0" t="0" r="0" b="0"/>
+            <wp:docPr id="883782333" name="Picture 1"/>
+            <wp:cNvGraphicFramePr>
+              <a:graphicFrameLocks xmlns:a="http://schemas.openxmlformats.org/drawingml/2006/main" noChangeAspect="1"/>
+            </wp:cNvGraphicFramePr>
+            <a:graphic xmlns:a="http://schemas.openxmlformats.org/drawingml/2006/main">
+              <a:graphicData uri="http://schemas.openxmlformats.org/drawingml/2006/picture">
+                <pic:pic xmlns:pic="http://schemas.openxmlformats.org/drawingml/2006/picture">
+                  <pic:nvPicPr>
+                    <pic:cNvPr id="883782333" name=""/>
+                    <pic:cNvPicPr/>
+                  </pic:nvPicPr>
+                  <pic:blipFill>
+                    <a:blip r:embed="rId16"/>
+                    <a:stretch>
+                      <a:fillRect/>
+                    </a:stretch>
+                  </pic:blipFill>
+                  <pic:spPr>
+                    <a:xfrm>
+                      <a:off x="0" y="0"/>
+                      <a:ext cx="2563224" cy="1666096"/>
+                    </a:xfrm>
+                    <a:prstGeom prst="rect">
+                      <a:avLst/>
+                    </a:prstGeom>
+                  </pic:spPr>
+                </pic:pic>
+              </a:graphicData>
+            </a:graphic>
+          </wp:inline>
+        </w:drawing>
+      </w:r>
+      <w:r>
+        <w:drawing>
+          <wp:inline distT="0" distB="0" distL="0" distR="0" wp14:anchorId="6F4B40B2" wp14:editId="7B88E76C">
+            <wp:extent cx="1844040" cy="1655302"/>
+            <wp:effectExtent l="0" t="0" r="3810" b="2540"/>
+            <wp:docPr id="1777224475" name="Picture 1"/>
+            <wp:cNvGraphicFramePr>
+              <a:graphicFrameLocks xmlns:a="http://schemas.openxmlformats.org/drawingml/2006/main" noChangeAspect="1"/>
+            </wp:cNvGraphicFramePr>
+            <a:graphic xmlns:a="http://schemas.openxmlformats.org/drawingml/2006/main">
+              <a:graphicData uri="http://schemas.openxmlformats.org/drawingml/2006/picture">
+                <pic:pic xmlns:pic="http://schemas.openxmlformats.org/drawingml/2006/picture">
+                  <pic:nvPicPr>
+                    <pic:cNvPr id="1777224475" name=""/>
+                    <pic:cNvPicPr/>
+                  </pic:nvPicPr>
+                  <pic:blipFill>
+                    <a:blip r:embed="rId17"/>
+                    <a:stretch>
+                      <a:fillRect/>
+                    </a:stretch>
+                  </pic:blipFill>
+                  <pic:spPr>
+                    <a:xfrm>
+                      <a:off x="0" y="0"/>
+                      <a:ext cx="1863560" cy="1672824"/>
+                    </a:xfrm>
+                    <a:prstGeom prst="rect">
+                      <a:avLst/>
+                    </a:prstGeom>
+                  </pic:spPr>
+                </pic:pic>
+              </a:graphicData>
+            </a:graphic>
+          </wp:inline>
+        </w:drawing>
+      </w:r>
+    </w:p>
+    <w:p>
+      <w:r>
+        <w:t>Same we will have priority choices we want dropdown so that it prevent invalid values like Done to keep the database consistent.</w:t>
+      </w:r>
+    </w:p>
+    <w:p>
+      <w:pPr>
+        <w:rPr>
+          <w:b/>
+          <w:bCs/>
+        </w:rPr>
+      </w:pPr>
+      <w:r>
+        <w:rPr>
+          <w:b/>
+          <w:bCs/>
+        </w:rPr>
+        <w:t>Relationship: Task belongs to a Project</w:t>
+      </w:r>
+    </w:p>
+    <w:p>
+      <w:r>
+        <w:t>Spec says:</w:t>
+      </w:r>
+      <w:r>
+        <w:t xml:space="preserve"> </w:t>
+      </w:r>
+      <w:r>
+        <w:t>Task: … project (</w:t>
+      </w:r>
+      <w:proofErr w:type="spellStart"/>
+      <w:r>
+        <w:t>ForeignKey</w:t>
+      </w:r>
+      <w:proofErr w:type="spellEnd"/>
+      <w:r>
+        <w:t xml:space="preserve"> to Project</w:t>
+      </w:r>
+      <w:r>
+        <w:t>)</w:t>
+      </w:r>
+    </w:p>
+    <w:p>
+      <w:pPr>
+        <w:rPr>
+          <w:b/>
+          <w:bCs/>
+        </w:rPr>
+      </w:pPr>
+      <w:r>
+        <w:rPr>
+          <w:b/>
+          <w:bCs/>
+        </w:rPr>
+        <w:t>Relationship: Task assigned to a User</w:t>
+      </w:r>
+    </w:p>
+    <w:p>
+      <w:r>
+        <w:t>Spec says:</w:t>
+      </w:r>
+      <w:r>
+        <w:t xml:space="preserve"> </w:t>
+      </w:r>
+      <w:r>
+        <w:t>assignee (</w:t>
+      </w:r>
+      <w:proofErr w:type="spellStart"/>
+      <w:r>
+        <w:t>ForeignKey</w:t>
+      </w:r>
+      <w:proofErr w:type="spellEnd"/>
+      <w:r>
+        <w:t xml:space="preserve"> to User) </w:t>
+      </w:r>
+    </w:p>
+    <w:p/>
+    <w:p>
+      <w:r>
+        <w:drawing>
+          <wp:inline distT="0" distB="0" distL="0" distR="0" wp14:anchorId="7219A7BF" wp14:editId="3688F218">
+            <wp:extent cx="2377440" cy="1988820"/>
+            <wp:effectExtent l="0" t="0" r="3810" b="0"/>
+            <wp:docPr id="1460065409" name="Picture 1"/>
+            <wp:cNvGraphicFramePr>
+              <a:graphicFrameLocks xmlns:a="http://schemas.openxmlformats.org/drawingml/2006/main" noChangeAspect="1"/>
+            </wp:cNvGraphicFramePr>
+            <a:graphic xmlns:a="http://schemas.openxmlformats.org/drawingml/2006/main">
+              <a:graphicData uri="http://schemas.openxmlformats.org/drawingml/2006/picture">
+                <pic:pic xmlns:pic="http://schemas.openxmlformats.org/drawingml/2006/picture">
+                  <pic:nvPicPr>
+                    <pic:cNvPr id="1460065409" name=""/>
+                    <pic:cNvPicPr/>
+                  </pic:nvPicPr>
+                  <pic:blipFill>
+                    <a:blip r:embed="rId18"/>
+                    <a:stretch>
+                      <a:fillRect/>
+                    </a:stretch>
+                  </pic:blipFill>
+                  <pic:spPr>
+                    <a:xfrm>
+                      <a:off x="0" y="0"/>
+                      <a:ext cx="2389181" cy="1998642"/>
+                    </a:xfrm>
+                    <a:prstGeom prst="rect">
+                      <a:avLst/>
+                    </a:prstGeom>
+                  </pic:spPr>
+                </pic:pic>
+              </a:graphicData>
+            </a:graphic>
+          </wp:inline>
+        </w:drawing>
+      </w:r>
+    </w:p>
+    <w:p/>
     <w:sectPr>
       <w:pgSz w:w="12240" w:h="15840"/>
       <w:pgMar w:top="1440" w:right="1440" w:bottom="1440" w:left="1440" w:header="720" w:footer="720" w:gutter="0"/>

</xml_diff>

<commit_message>
Add dashboard summary counts and task list
</commit_message>
<xml_diff>
--- a/Lookup.docx
+++ b/Lookup.docx
@@ -611,7 +611,15 @@
     </w:p>
     <w:p>
       <w:r>
-        <w:t>Same we will have priority choices we want dropdown so that it prevent invalid values like Done to keep the database consistent.</w:t>
+        <w:t xml:space="preserve">Same we will have priority choices we want dropdown so that it </w:t>
+      </w:r>
+      <w:proofErr w:type="gramStart"/>
+      <w:r>
+        <w:t>prevent</w:t>
+      </w:r>
+      <w:proofErr w:type="gramEnd"/>
+      <w:r>
+        <w:t xml:space="preserve"> invalid values like Done to keep the database consistent.</w:t>
       </w:r>
     </w:p>
     <w:p>
@@ -724,8 +732,649 @@
           </wp:inline>
         </w:drawing>
       </w:r>
-    </w:p>
-    <w:p/>
+      <w:r>
+        <w:drawing>
+          <wp:inline distT="0" distB="0" distL="0" distR="0" wp14:anchorId="7F5357DC" wp14:editId="342A0860">
+            <wp:extent cx="2255520" cy="1863696"/>
+            <wp:effectExtent l="0" t="0" r="0" b="3810"/>
+            <wp:docPr id="1565563349" name="Picture 1"/>
+            <wp:cNvGraphicFramePr>
+              <a:graphicFrameLocks xmlns:a="http://schemas.openxmlformats.org/drawingml/2006/main" noChangeAspect="1"/>
+            </wp:cNvGraphicFramePr>
+            <a:graphic xmlns:a="http://schemas.openxmlformats.org/drawingml/2006/main">
+              <a:graphicData uri="http://schemas.openxmlformats.org/drawingml/2006/picture">
+                <pic:pic xmlns:pic="http://schemas.openxmlformats.org/drawingml/2006/picture">
+                  <pic:nvPicPr>
+                    <pic:cNvPr id="1565563349" name=""/>
+                    <pic:cNvPicPr/>
+                  </pic:nvPicPr>
+                  <pic:blipFill>
+                    <a:blip r:embed="rId19"/>
+                    <a:stretch>
+                      <a:fillRect/>
+                    </a:stretch>
+                  </pic:blipFill>
+                  <pic:spPr>
+                    <a:xfrm>
+                      <a:off x="0" y="0"/>
+                      <a:ext cx="2272364" cy="1877614"/>
+                    </a:xfrm>
+                    <a:prstGeom prst="rect">
+                      <a:avLst/>
+                    </a:prstGeom>
+                  </pic:spPr>
+                </pic:pic>
+              </a:graphicData>
+            </a:graphic>
+          </wp:inline>
+        </w:drawing>
+      </w:r>
+    </w:p>
+    <w:p>
+      <w:pPr>
+        <w:rPr>
+          <w:b/>
+          <w:bCs/>
+        </w:rPr>
+      </w:pPr>
+      <w:r>
+        <w:rPr>
+          <w:b/>
+          <w:bCs/>
+        </w:rPr>
+        <w:t>Comment Model</w:t>
+      </w:r>
+    </w:p>
+    <w:p>
+      <w:pPr>
+        <w:rPr>
+          <w:b/>
+          <w:bCs/>
+        </w:rPr>
+      </w:pPr>
+      <w:r>
+        <w:rPr>
+          <w:b/>
+          <w:bCs/>
+        </w:rPr>
+        <w:drawing>
+          <wp:inline distT="0" distB="0" distL="0" distR="0" wp14:anchorId="79D1E3EF" wp14:editId="7CAC895E">
+            <wp:extent cx="2533650" cy="1493662"/>
+            <wp:effectExtent l="0" t="0" r="0" b="0"/>
+            <wp:docPr id="986875032" name="Picture 1"/>
+            <wp:cNvGraphicFramePr>
+              <a:graphicFrameLocks xmlns:a="http://schemas.openxmlformats.org/drawingml/2006/main" noChangeAspect="1"/>
+            </wp:cNvGraphicFramePr>
+            <a:graphic xmlns:a="http://schemas.openxmlformats.org/drawingml/2006/main">
+              <a:graphicData uri="http://schemas.openxmlformats.org/drawingml/2006/picture">
+                <pic:pic xmlns:pic="http://schemas.openxmlformats.org/drawingml/2006/picture">
+                  <pic:nvPicPr>
+                    <pic:cNvPr id="986875032" name=""/>
+                    <pic:cNvPicPr/>
+                  </pic:nvPicPr>
+                  <pic:blipFill>
+                    <a:blip r:embed="rId20"/>
+                    <a:stretch>
+                      <a:fillRect/>
+                    </a:stretch>
+                  </pic:blipFill>
+                  <pic:spPr>
+                    <a:xfrm>
+                      <a:off x="0" y="0"/>
+                      <a:ext cx="2549328" cy="1502905"/>
+                    </a:xfrm>
+                    <a:prstGeom prst="rect">
+                      <a:avLst/>
+                    </a:prstGeom>
+                  </pic:spPr>
+                </pic:pic>
+              </a:graphicData>
+            </a:graphic>
+          </wp:inline>
+        </w:drawing>
+      </w:r>
+      <w:r>
+        <w:rPr>
+          <w:b/>
+          <w:bCs/>
+        </w:rPr>
+        <w:drawing>
+          <wp:inline distT="0" distB="0" distL="0" distR="0" wp14:anchorId="401E98B6" wp14:editId="63759624">
+            <wp:extent cx="2762250" cy="1399717"/>
+            <wp:effectExtent l="0" t="0" r="0" b="0"/>
+            <wp:docPr id="1172866083" name="Picture 1"/>
+            <wp:cNvGraphicFramePr>
+              <a:graphicFrameLocks xmlns:a="http://schemas.openxmlformats.org/drawingml/2006/main" noChangeAspect="1"/>
+            </wp:cNvGraphicFramePr>
+            <a:graphic xmlns:a="http://schemas.openxmlformats.org/drawingml/2006/main">
+              <a:graphicData uri="http://schemas.openxmlformats.org/drawingml/2006/picture">
+                <pic:pic xmlns:pic="http://schemas.openxmlformats.org/drawingml/2006/picture">
+                  <pic:nvPicPr>
+                    <pic:cNvPr id="1172866083" name=""/>
+                    <pic:cNvPicPr/>
+                  </pic:nvPicPr>
+                  <pic:blipFill>
+                    <a:blip r:embed="rId21"/>
+                    <a:stretch>
+                      <a:fillRect/>
+                    </a:stretch>
+                  </pic:blipFill>
+                  <pic:spPr>
+                    <a:xfrm>
+                      <a:off x="0" y="0"/>
+                      <a:ext cx="2794417" cy="1416017"/>
+                    </a:xfrm>
+                    <a:prstGeom prst="rect">
+                      <a:avLst/>
+                    </a:prstGeom>
+                  </pic:spPr>
+                </pic:pic>
+              </a:graphicData>
+            </a:graphic>
+          </wp:inline>
+        </w:drawing>
+      </w:r>
+    </w:p>
+    <w:p>
+      <w:pPr>
+        <w:pBdr>
+          <w:bottom w:val="single" w:sz="6" w:space="1" w:color="auto"/>
+        </w:pBdr>
+        <w:rPr>
+          <w:b/>
+          <w:bCs/>
+        </w:rPr>
+      </w:pPr>
+      <w:r>
+        <w:rPr>
+          <w:b/>
+          <w:bCs/>
+        </w:rPr>
+        <w:drawing>
+          <wp:inline distT="0" distB="0" distL="0" distR="0" wp14:anchorId="18EEB7DC" wp14:editId="3697EDDA">
+            <wp:extent cx="2867025" cy="1194287"/>
+            <wp:effectExtent l="0" t="0" r="0" b="6350"/>
+            <wp:docPr id="751612926" name="Picture 1"/>
+            <wp:cNvGraphicFramePr>
+              <a:graphicFrameLocks xmlns:a="http://schemas.openxmlformats.org/drawingml/2006/main" noChangeAspect="1"/>
+            </wp:cNvGraphicFramePr>
+            <a:graphic xmlns:a="http://schemas.openxmlformats.org/drawingml/2006/main">
+              <a:graphicData uri="http://schemas.openxmlformats.org/drawingml/2006/picture">
+                <pic:pic xmlns:pic="http://schemas.openxmlformats.org/drawingml/2006/picture">
+                  <pic:nvPicPr>
+                    <pic:cNvPr id="751612926" name=""/>
+                    <pic:cNvPicPr/>
+                  </pic:nvPicPr>
+                  <pic:blipFill>
+                    <a:blip r:embed="rId22"/>
+                    <a:stretch>
+                      <a:fillRect/>
+                    </a:stretch>
+                  </pic:blipFill>
+                  <pic:spPr>
+                    <a:xfrm>
+                      <a:off x="0" y="0"/>
+                      <a:ext cx="2907816" cy="1211279"/>
+                    </a:xfrm>
+                    <a:prstGeom prst="rect">
+                      <a:avLst/>
+                    </a:prstGeom>
+                  </pic:spPr>
+                </pic:pic>
+              </a:graphicData>
+            </a:graphic>
+          </wp:inline>
+        </w:drawing>
+      </w:r>
+    </w:p>
+    <w:p>
+      <w:pPr>
+        <w:rPr>
+          <w:b/>
+          <w:bCs/>
+        </w:rPr>
+      </w:pPr>
+      <w:r>
+        <w:rPr>
+          <w:b/>
+          <w:bCs/>
+        </w:rPr>
+        <w:drawing>
+          <wp:inline distT="0" distB="0" distL="0" distR="0" wp14:anchorId="421232E2" wp14:editId="1EBEE78E">
+            <wp:extent cx="2771775" cy="1724955"/>
+            <wp:effectExtent l="0" t="0" r="0" b="8890"/>
+            <wp:docPr id="1486178477" name="Picture 1"/>
+            <wp:cNvGraphicFramePr>
+              <a:graphicFrameLocks xmlns:a="http://schemas.openxmlformats.org/drawingml/2006/main" noChangeAspect="1"/>
+            </wp:cNvGraphicFramePr>
+            <a:graphic xmlns:a="http://schemas.openxmlformats.org/drawingml/2006/main">
+              <a:graphicData uri="http://schemas.openxmlformats.org/drawingml/2006/picture">
+                <pic:pic xmlns:pic="http://schemas.openxmlformats.org/drawingml/2006/picture">
+                  <pic:nvPicPr>
+                    <pic:cNvPr id="1486178477" name=""/>
+                    <pic:cNvPicPr/>
+                  </pic:nvPicPr>
+                  <pic:blipFill>
+                    <a:blip r:embed="rId23"/>
+                    <a:stretch>
+                      <a:fillRect/>
+                    </a:stretch>
+                  </pic:blipFill>
+                  <pic:spPr>
+                    <a:xfrm>
+                      <a:off x="0" y="0"/>
+                      <a:ext cx="2781540" cy="1731032"/>
+                    </a:xfrm>
+                    <a:prstGeom prst="rect">
+                      <a:avLst/>
+                    </a:prstGeom>
+                  </pic:spPr>
+                </pic:pic>
+              </a:graphicData>
+            </a:graphic>
+          </wp:inline>
+        </w:drawing>
+      </w:r>
+      <w:r>
+        <w:rPr>
+          <w:b/>
+          <w:bCs/>
+        </w:rPr>
+        <w:drawing>
+          <wp:inline distT="0" distB="0" distL="0" distR="0" wp14:anchorId="4036E0C5" wp14:editId="4D2021FA">
+            <wp:extent cx="2795530" cy="1933575"/>
+            <wp:effectExtent l="0" t="0" r="5080" b="0"/>
+            <wp:docPr id="2079507084" name="Picture 1"/>
+            <wp:cNvGraphicFramePr>
+              <a:graphicFrameLocks xmlns:a="http://schemas.openxmlformats.org/drawingml/2006/main" noChangeAspect="1"/>
+            </wp:cNvGraphicFramePr>
+            <a:graphic xmlns:a="http://schemas.openxmlformats.org/drawingml/2006/main">
+              <a:graphicData uri="http://schemas.openxmlformats.org/drawingml/2006/picture">
+                <pic:pic xmlns:pic="http://schemas.openxmlformats.org/drawingml/2006/picture">
+                  <pic:nvPicPr>
+                    <pic:cNvPr id="2079507084" name=""/>
+                    <pic:cNvPicPr/>
+                  </pic:nvPicPr>
+                  <pic:blipFill>
+                    <a:blip r:embed="rId24"/>
+                    <a:stretch>
+                      <a:fillRect/>
+                    </a:stretch>
+                  </pic:blipFill>
+                  <pic:spPr>
+                    <a:xfrm>
+                      <a:off x="0" y="0"/>
+                      <a:ext cx="2803769" cy="1939273"/>
+                    </a:xfrm>
+                    <a:prstGeom prst="rect">
+                      <a:avLst/>
+                    </a:prstGeom>
+                  </pic:spPr>
+                </pic:pic>
+              </a:graphicData>
+            </a:graphic>
+          </wp:inline>
+        </w:drawing>
+      </w:r>
+    </w:p>
+    <w:p>
+      <w:pPr>
+        <w:rPr>
+          <w:b/>
+          <w:bCs/>
+        </w:rPr>
+      </w:pPr>
+    </w:p>
+    <w:p>
+      <w:pPr>
+        <w:rPr>
+          <w:b/>
+          <w:bCs/>
+        </w:rPr>
+      </w:pPr>
+      <w:r>
+        <w:rPr>
+          <w:b/>
+          <w:bCs/>
+        </w:rPr>
+        <w:lastRenderedPageBreak/>
+        <w:drawing>
+          <wp:inline distT="0" distB="0" distL="0" distR="0" wp14:anchorId="670A8E07" wp14:editId="134EC0F4">
+            <wp:extent cx="2047875" cy="2081668"/>
+            <wp:effectExtent l="0" t="0" r="0" b="0"/>
+            <wp:docPr id="102290565" name="Picture 1"/>
+            <wp:cNvGraphicFramePr>
+              <a:graphicFrameLocks xmlns:a="http://schemas.openxmlformats.org/drawingml/2006/main" noChangeAspect="1"/>
+            </wp:cNvGraphicFramePr>
+            <a:graphic xmlns:a="http://schemas.openxmlformats.org/drawingml/2006/main">
+              <a:graphicData uri="http://schemas.openxmlformats.org/drawingml/2006/picture">
+                <pic:pic xmlns:pic="http://schemas.openxmlformats.org/drawingml/2006/picture">
+                  <pic:nvPicPr>
+                    <pic:cNvPr id="102290565" name=""/>
+                    <pic:cNvPicPr/>
+                  </pic:nvPicPr>
+                  <pic:blipFill>
+                    <a:blip r:embed="rId25"/>
+                    <a:stretch>
+                      <a:fillRect/>
+                    </a:stretch>
+                  </pic:blipFill>
+                  <pic:spPr>
+                    <a:xfrm>
+                      <a:off x="0" y="0"/>
+                      <a:ext cx="2053236" cy="2087117"/>
+                    </a:xfrm>
+                    <a:prstGeom prst="rect">
+                      <a:avLst/>
+                    </a:prstGeom>
+                  </pic:spPr>
+                </pic:pic>
+              </a:graphicData>
+            </a:graphic>
+          </wp:inline>
+        </w:drawing>
+      </w:r>
+      <w:r>
+        <w:rPr>
+          <w:b/>
+          <w:bCs/>
+        </w:rPr>
+        <w:drawing>
+          <wp:inline distT="0" distB="0" distL="0" distR="0" wp14:anchorId="179DEFA6" wp14:editId="5C9749D7">
+            <wp:extent cx="2847975" cy="1893173"/>
+            <wp:effectExtent l="0" t="0" r="0" b="0"/>
+            <wp:docPr id="1694999941" name="Picture 1"/>
+            <wp:cNvGraphicFramePr>
+              <a:graphicFrameLocks xmlns:a="http://schemas.openxmlformats.org/drawingml/2006/main" noChangeAspect="1"/>
+            </wp:cNvGraphicFramePr>
+            <a:graphic xmlns:a="http://schemas.openxmlformats.org/drawingml/2006/main">
+              <a:graphicData uri="http://schemas.openxmlformats.org/drawingml/2006/picture">
+                <pic:pic xmlns:pic="http://schemas.openxmlformats.org/drawingml/2006/picture">
+                  <pic:nvPicPr>
+                    <pic:cNvPr id="1694999941" name=""/>
+                    <pic:cNvPicPr/>
+                  </pic:nvPicPr>
+                  <pic:blipFill>
+                    <a:blip r:embed="rId26"/>
+                    <a:stretch>
+                      <a:fillRect/>
+                    </a:stretch>
+                  </pic:blipFill>
+                  <pic:spPr>
+                    <a:xfrm>
+                      <a:off x="0" y="0"/>
+                      <a:ext cx="2858908" cy="1900441"/>
+                    </a:xfrm>
+                    <a:prstGeom prst="rect">
+                      <a:avLst/>
+                    </a:prstGeom>
+                  </pic:spPr>
+                </pic:pic>
+              </a:graphicData>
+            </a:graphic>
+          </wp:inline>
+        </w:drawing>
+      </w:r>
+    </w:p>
+    <w:p>
+      <w:pPr>
+        <w:rPr>
+          <w:b/>
+          <w:bCs/>
+        </w:rPr>
+      </w:pPr>
+      <w:r>
+        <w:rPr>
+          <w:b/>
+          <w:bCs/>
+        </w:rPr>
+        <w:drawing>
+          <wp:inline distT="0" distB="0" distL="0" distR="0" wp14:anchorId="465A0BDC" wp14:editId="534DBDF4">
+            <wp:extent cx="2785632" cy="1924050"/>
+            <wp:effectExtent l="0" t="0" r="0" b="0"/>
+            <wp:docPr id="1366062089" name="Picture 1"/>
+            <wp:cNvGraphicFramePr>
+              <a:graphicFrameLocks xmlns:a="http://schemas.openxmlformats.org/drawingml/2006/main" noChangeAspect="1"/>
+            </wp:cNvGraphicFramePr>
+            <a:graphic xmlns:a="http://schemas.openxmlformats.org/drawingml/2006/main">
+              <a:graphicData uri="http://schemas.openxmlformats.org/drawingml/2006/picture">
+                <pic:pic xmlns:pic="http://schemas.openxmlformats.org/drawingml/2006/picture">
+                  <pic:nvPicPr>
+                    <pic:cNvPr id="1366062089" name=""/>
+                    <pic:cNvPicPr/>
+                  </pic:nvPicPr>
+                  <pic:blipFill>
+                    <a:blip r:embed="rId27"/>
+                    <a:stretch>
+                      <a:fillRect/>
+                    </a:stretch>
+                  </pic:blipFill>
+                  <pic:spPr>
+                    <a:xfrm>
+                      <a:off x="0" y="0"/>
+                      <a:ext cx="2789404" cy="1926655"/>
+                    </a:xfrm>
+                    <a:prstGeom prst="rect">
+                      <a:avLst/>
+                    </a:prstGeom>
+                  </pic:spPr>
+                </pic:pic>
+              </a:graphicData>
+            </a:graphic>
+          </wp:inline>
+        </w:drawing>
+      </w:r>
+      <w:r>
+        <w:rPr>
+          <w:b/>
+          <w:bCs/>
+        </w:rPr>
+        <w:drawing>
+          <wp:inline distT="0" distB="0" distL="0" distR="0" wp14:anchorId="3B960465" wp14:editId="371DEB5A">
+            <wp:extent cx="1800225" cy="1908700"/>
+            <wp:effectExtent l="0" t="0" r="0" b="0"/>
+            <wp:docPr id="1145998830" name="Picture 1"/>
+            <wp:cNvGraphicFramePr>
+              <a:graphicFrameLocks xmlns:a="http://schemas.openxmlformats.org/drawingml/2006/main" noChangeAspect="1"/>
+            </wp:cNvGraphicFramePr>
+            <a:graphic xmlns:a="http://schemas.openxmlformats.org/drawingml/2006/main">
+              <a:graphicData uri="http://schemas.openxmlformats.org/drawingml/2006/picture">
+                <pic:pic xmlns:pic="http://schemas.openxmlformats.org/drawingml/2006/picture">
+                  <pic:nvPicPr>
+                    <pic:cNvPr id="1145998830" name=""/>
+                    <pic:cNvPicPr/>
+                  </pic:nvPicPr>
+                  <pic:blipFill>
+                    <a:blip r:embed="rId28"/>
+                    <a:stretch>
+                      <a:fillRect/>
+                    </a:stretch>
+                  </pic:blipFill>
+                  <pic:spPr>
+                    <a:xfrm>
+                      <a:off x="0" y="0"/>
+                      <a:ext cx="1817144" cy="1926639"/>
+                    </a:xfrm>
+                    <a:prstGeom prst="rect">
+                      <a:avLst/>
+                    </a:prstGeom>
+                  </pic:spPr>
+                </pic:pic>
+              </a:graphicData>
+            </a:graphic>
+          </wp:inline>
+        </w:drawing>
+      </w:r>
+    </w:p>
+    <w:p>
+      <w:pPr>
+        <w:rPr>
+          <w:b/>
+          <w:bCs/>
+        </w:rPr>
+      </w:pPr>
+      <w:r>
+        <w:rPr>
+          <w:b/>
+          <w:bCs/>
+        </w:rPr>
+        <w:t>6) templates/tasks/dashboard.html → display tasks</w:t>
+      </w:r>
+    </w:p>
+    <w:p>
+      <w:pPr>
+        <w:rPr>
+          <w:b/>
+          <w:bCs/>
+        </w:rPr>
+      </w:pPr>
+      <w:r>
+        <w:rPr>
+          <w:b/>
+          <w:bCs/>
+        </w:rPr>
+        <w:drawing>
+          <wp:inline distT="0" distB="0" distL="0" distR="0" wp14:anchorId="006C5987" wp14:editId="2027FFC2">
+            <wp:extent cx="2019300" cy="2562370"/>
+            <wp:effectExtent l="0" t="0" r="0" b="9525"/>
+            <wp:docPr id="148252850" name="Picture 1"/>
+            <wp:cNvGraphicFramePr>
+              <a:graphicFrameLocks xmlns:a="http://schemas.openxmlformats.org/drawingml/2006/main" noChangeAspect="1"/>
+            </wp:cNvGraphicFramePr>
+            <a:graphic xmlns:a="http://schemas.openxmlformats.org/drawingml/2006/main">
+              <a:graphicData uri="http://schemas.openxmlformats.org/drawingml/2006/picture">
+                <pic:pic xmlns:pic="http://schemas.openxmlformats.org/drawingml/2006/picture">
+                  <pic:nvPicPr>
+                    <pic:cNvPr id="148252850" name=""/>
+                    <pic:cNvPicPr/>
+                  </pic:nvPicPr>
+                  <pic:blipFill>
+                    <a:blip r:embed="rId29"/>
+                    <a:stretch>
+                      <a:fillRect/>
+                    </a:stretch>
+                  </pic:blipFill>
+                  <pic:spPr>
+                    <a:xfrm>
+                      <a:off x="0" y="0"/>
+                      <a:ext cx="2027279" cy="2572495"/>
+                    </a:xfrm>
+                    <a:prstGeom prst="rect">
+                      <a:avLst/>
+                    </a:prstGeom>
+                  </pic:spPr>
+                </pic:pic>
+              </a:graphicData>
+            </a:graphic>
+          </wp:inline>
+        </w:drawing>
+      </w:r>
+      <w:r>
+        <w:rPr>
+          <w:b/>
+          <w:bCs/>
+        </w:rPr>
+        <w:drawing>
+          <wp:inline distT="0" distB="0" distL="0" distR="0" wp14:anchorId="7837B942" wp14:editId="593B7BEA">
+            <wp:extent cx="1609725" cy="1218792"/>
+            <wp:effectExtent l="0" t="0" r="0" b="635"/>
+            <wp:docPr id="1813232968" name="Picture 1"/>
+            <wp:cNvGraphicFramePr>
+              <a:graphicFrameLocks xmlns:a="http://schemas.openxmlformats.org/drawingml/2006/main" noChangeAspect="1"/>
+            </wp:cNvGraphicFramePr>
+            <a:graphic xmlns:a="http://schemas.openxmlformats.org/drawingml/2006/main">
+              <a:graphicData uri="http://schemas.openxmlformats.org/drawingml/2006/picture">
+                <pic:pic xmlns:pic="http://schemas.openxmlformats.org/drawingml/2006/picture">
+                  <pic:nvPicPr>
+                    <pic:cNvPr id="1813232968" name=""/>
+                    <pic:cNvPicPr/>
+                  </pic:nvPicPr>
+                  <pic:blipFill>
+                    <a:blip r:embed="rId30"/>
+                    <a:stretch>
+                      <a:fillRect/>
+                    </a:stretch>
+                  </pic:blipFill>
+                  <pic:spPr>
+                    <a:xfrm>
+                      <a:off x="0" y="0"/>
+                      <a:ext cx="1615998" cy="1223542"/>
+                    </a:xfrm>
+                    <a:prstGeom prst="rect">
+                      <a:avLst/>
+                    </a:prstGeom>
+                  </pic:spPr>
+                </pic:pic>
+              </a:graphicData>
+            </a:graphic>
+          </wp:inline>
+        </w:drawing>
+      </w:r>
+      <w:r>
+        <w:rPr>
+          <w:b/>
+          <w:bCs/>
+        </w:rPr>
+        <w:drawing>
+          <wp:inline distT="0" distB="0" distL="0" distR="0" wp14:anchorId="1F7019FA" wp14:editId="577E815B">
+            <wp:extent cx="1504950" cy="1489697"/>
+            <wp:effectExtent l="0" t="0" r="0" b="0"/>
+            <wp:docPr id="1126965679" name="Picture 1"/>
+            <wp:cNvGraphicFramePr>
+              <a:graphicFrameLocks xmlns:a="http://schemas.openxmlformats.org/drawingml/2006/main" noChangeAspect="1"/>
+            </wp:cNvGraphicFramePr>
+            <a:graphic xmlns:a="http://schemas.openxmlformats.org/drawingml/2006/main">
+              <a:graphicData uri="http://schemas.openxmlformats.org/drawingml/2006/picture">
+                <pic:pic xmlns:pic="http://schemas.openxmlformats.org/drawingml/2006/picture">
+                  <pic:nvPicPr>
+                    <pic:cNvPr id="1126965679" name=""/>
+                    <pic:cNvPicPr/>
+                  </pic:nvPicPr>
+                  <pic:blipFill>
+                    <a:blip r:embed="rId31"/>
+                    <a:stretch>
+                      <a:fillRect/>
+                    </a:stretch>
+                  </pic:blipFill>
+                  <pic:spPr>
+                    <a:xfrm>
+                      <a:off x="0" y="0"/>
+                      <a:ext cx="1514522" cy="1499172"/>
+                    </a:xfrm>
+                    <a:prstGeom prst="rect">
+                      <a:avLst/>
+                    </a:prstGeom>
+                  </pic:spPr>
+                </pic:pic>
+              </a:graphicData>
+            </a:graphic>
+          </wp:inline>
+        </w:drawing>
+      </w:r>
+    </w:p>
+    <w:p>
+      <w:pPr>
+        <w:rPr>
+          <w:b/>
+          <w:bCs/>
+        </w:rPr>
+      </w:pPr>
+      <w:r>
+        <w:rPr>
+          <w:b/>
+          <w:bCs/>
+        </w:rPr>
+        <w:t xml:space="preserve">Then create the login template </w:t>
+      </w:r>
+    </w:p>
+    <w:p>
+      <w:pPr>
+        <w:rPr>
+          <w:b/>
+          <w:bCs/>
+        </w:rPr>
+      </w:pPr>
+    </w:p>
     <w:sectPr>
       <w:pgSz w:w="12240" w:h="15840"/>
       <w:pgMar w:top="1440" w:right="1440" w:bottom="1440" w:left="1440" w:header="720" w:footer="720" w:gutter="0"/>

</xml_diff>

<commit_message>
almost completed functionality adding all templates and modifications
</commit_message>
<xml_diff>
--- a/Lookup.docx
+++ b/Lookup.docx
@@ -28,6 +28,9 @@
     </w:p>
     <w:p>
       <w:r>
+        <w:rPr>
+          <w:noProof/>
+        </w:rPr>
         <w:drawing>
           <wp:inline distT="0" distB="0" distL="0" distR="0" wp14:anchorId="2C400844" wp14:editId="51C4D3A7">
             <wp:extent cx="1828800" cy="2041016"/>
@@ -65,6 +68,9 @@
         </w:drawing>
       </w:r>
       <w:r>
+        <w:rPr>
+          <w:noProof/>
+        </w:rPr>
         <w:drawing>
           <wp:inline distT="0" distB="0" distL="0" distR="0" wp14:anchorId="390F2CFB" wp14:editId="71AC3344">
             <wp:extent cx="1495425" cy="1164191"/>
@@ -102,6 +108,9 @@
         </w:drawing>
       </w:r>
       <w:r>
+        <w:rPr>
+          <w:noProof/>
+        </w:rPr>
         <w:drawing>
           <wp:inline distT="0" distB="0" distL="0" distR="0" wp14:anchorId="47CE8CEB" wp14:editId="14C7A3AC">
             <wp:extent cx="1511945" cy="2400300"/>
@@ -142,6 +151,9 @@
     <w:p/>
     <w:p>
       <w:r>
+        <w:rPr>
+          <w:noProof/>
+        </w:rPr>
         <w:drawing>
           <wp:inline distT="0" distB="0" distL="0" distR="0" wp14:anchorId="787292A8" wp14:editId="62ADA529">
             <wp:extent cx="3243943" cy="1976171"/>
@@ -179,6 +191,9 @@
         </w:drawing>
       </w:r>
       <w:r>
+        <w:rPr>
+          <w:noProof/>
+        </w:rPr>
         <w:drawing>
           <wp:inline distT="0" distB="0" distL="0" distR="0" wp14:anchorId="22D1A3F4" wp14:editId="18FB064B">
             <wp:extent cx="2645229" cy="1675596"/>
@@ -259,6 +274,9 @@
     </w:p>
     <w:p>
       <w:r>
+        <w:rPr>
+          <w:noProof/>
+        </w:rPr>
         <w:drawing>
           <wp:inline distT="0" distB="0" distL="0" distR="0" wp14:anchorId="511EC95F" wp14:editId="4AF500AF">
             <wp:extent cx="2231387" cy="1397000"/>
@@ -296,6 +314,9 @@
         </w:drawing>
       </w:r>
       <w:r>
+        <w:rPr>
+          <w:noProof/>
+        </w:rPr>
         <w:drawing>
           <wp:inline distT="0" distB="0" distL="0" distR="0" wp14:anchorId="3F75CE85" wp14:editId="15857607">
             <wp:extent cx="1841500" cy="1504031"/>
@@ -335,6 +356,9 @@
     </w:p>
     <w:p>
       <w:r>
+        <w:rPr>
+          <w:noProof/>
+        </w:rPr>
         <w:lastRenderedPageBreak/>
         <w:drawing>
           <wp:inline distT="0" distB="0" distL="0" distR="0" wp14:anchorId="09504940" wp14:editId="4485CF45">
@@ -373,6 +397,9 @@
         </w:drawing>
       </w:r>
       <w:r>
+        <w:rPr>
+          <w:noProof/>
+        </w:rPr>
         <w:drawing>
           <wp:inline distT="0" distB="0" distL="0" distR="0" wp14:anchorId="7CB6906F" wp14:editId="6487678C">
             <wp:extent cx="2540000" cy="2140276"/>
@@ -422,6 +449,9 @@
         </w:pBdr>
       </w:pPr>
       <w:r>
+        <w:rPr>
+          <w:noProof/>
+        </w:rPr>
         <w:drawing>
           <wp:inline distT="0" distB="0" distL="0" distR="0" wp14:anchorId="48690DA8" wp14:editId="6E5323D6">
             <wp:extent cx="2641600" cy="1735102"/>
@@ -459,6 +489,9 @@
         </w:drawing>
       </w:r>
       <w:r>
+        <w:rPr>
+          <w:noProof/>
+        </w:rPr>
         <w:drawing>
           <wp:inline distT="0" distB="0" distL="0" distR="0" wp14:anchorId="721F29A2" wp14:editId="17A48D2B">
             <wp:extent cx="1333500" cy="1425239"/>
@@ -496,6 +529,9 @@
         </w:drawing>
       </w:r>
       <w:r>
+        <w:rPr>
+          <w:noProof/>
+        </w:rPr>
         <w:drawing>
           <wp:inline distT="0" distB="0" distL="0" distR="0" wp14:anchorId="562ACC8A" wp14:editId="1036698C">
             <wp:extent cx="1778000" cy="1044164"/>
@@ -535,6 +571,9 @@
     </w:p>
     <w:p>
       <w:r>
+        <w:rPr>
+          <w:noProof/>
+        </w:rPr>
         <w:drawing>
           <wp:inline distT="0" distB="0" distL="0" distR="0" wp14:anchorId="1E52AAE2" wp14:editId="5F50189D">
             <wp:extent cx="2559538" cy="1663700"/>
@@ -572,6 +611,9 @@
         </w:drawing>
       </w:r>
       <w:r>
+        <w:rPr>
+          <w:noProof/>
+        </w:rPr>
         <w:drawing>
           <wp:inline distT="0" distB="0" distL="0" distR="0" wp14:anchorId="6F4B40B2" wp14:editId="7B88E76C">
             <wp:extent cx="1844040" cy="1655302"/>
@@ -611,15 +653,7 @@
     </w:p>
     <w:p>
       <w:r>
-        <w:t xml:space="preserve">Same we will have priority choices we want dropdown so that it </w:t>
-      </w:r>
-      <w:proofErr w:type="gramStart"/>
-      <w:r>
-        <w:t>prevent</w:t>
-      </w:r>
-      <w:proofErr w:type="gramEnd"/>
-      <w:r>
-        <w:t xml:space="preserve"> invalid values like Done to keep the database consistent.</w:t>
+        <w:t>Same we will have priority choices we want dropdown so that it prevent invalid values like Done to keep the database consistent.</w:t>
       </w:r>
     </w:p>
     <w:p>
@@ -645,15 +679,7 @@
         <w:t xml:space="preserve"> </w:t>
       </w:r>
       <w:r>
-        <w:t>Task: … project (</w:t>
-      </w:r>
-      <w:proofErr w:type="spellStart"/>
-      <w:r>
-        <w:t>ForeignKey</w:t>
-      </w:r>
-      <w:proofErr w:type="spellEnd"/>
-      <w:r>
-        <w:t xml:space="preserve"> to Project</w:t>
+        <w:t>Task: … project (ForeignKey to Project</w:t>
       </w:r>
       <w:r>
         <w:t>)</w:t>
@@ -682,20 +708,15 @@
         <w:t xml:space="preserve"> </w:t>
       </w:r>
       <w:r>
-        <w:t>assignee (</w:t>
-      </w:r>
-      <w:proofErr w:type="spellStart"/>
-      <w:r>
-        <w:t>ForeignKey</w:t>
-      </w:r>
-      <w:proofErr w:type="spellEnd"/>
-      <w:r>
-        <w:t xml:space="preserve"> to User) </w:t>
+        <w:t xml:space="preserve">assignee (ForeignKey to User) </w:t>
       </w:r>
     </w:p>
     <w:p/>
     <w:p>
       <w:r>
+        <w:rPr>
+          <w:noProof/>
+        </w:rPr>
         <w:drawing>
           <wp:inline distT="0" distB="0" distL="0" distR="0" wp14:anchorId="7219A7BF" wp14:editId="3688F218">
             <wp:extent cx="2377440" cy="1988820"/>
@@ -733,6 +754,9 @@
         </w:drawing>
       </w:r>
       <w:r>
+        <w:rPr>
+          <w:noProof/>
+        </w:rPr>
         <w:drawing>
           <wp:inline distT="0" distB="0" distL="0" distR="0" wp14:anchorId="7F5357DC" wp14:editId="342A0860">
             <wp:extent cx="2255520" cy="1863696"/>
@@ -796,6 +820,7 @@
         <w:rPr>
           <w:b/>
           <w:bCs/>
+          <w:noProof/>
         </w:rPr>
         <w:drawing>
           <wp:inline distT="0" distB="0" distL="0" distR="0" wp14:anchorId="79D1E3EF" wp14:editId="7CAC895E">
@@ -837,6 +862,7 @@
         <w:rPr>
           <w:b/>
           <w:bCs/>
+          <w:noProof/>
         </w:rPr>
         <w:drawing>
           <wp:inline distT="0" distB="0" distL="0" distR="0" wp14:anchorId="401E98B6" wp14:editId="63759624">
@@ -889,6 +915,7 @@
         <w:rPr>
           <w:b/>
           <w:bCs/>
+          <w:noProof/>
         </w:rPr>
         <w:drawing>
           <wp:inline distT="0" distB="0" distL="0" distR="0" wp14:anchorId="18EEB7DC" wp14:editId="3697EDDA">
@@ -938,6 +965,7 @@
         <w:rPr>
           <w:b/>
           <w:bCs/>
+          <w:noProof/>
         </w:rPr>
         <w:drawing>
           <wp:inline distT="0" distB="0" distL="0" distR="0" wp14:anchorId="421232E2" wp14:editId="1EBEE78E">
@@ -979,6 +1007,7 @@
         <w:rPr>
           <w:b/>
           <w:bCs/>
+          <w:noProof/>
         </w:rPr>
         <w:drawing>
           <wp:inline distT="0" distB="0" distL="0" distR="0" wp14:anchorId="4036E0C5" wp14:editId="4D2021FA">
@@ -1036,6 +1065,7 @@
         <w:rPr>
           <w:b/>
           <w:bCs/>
+          <w:noProof/>
         </w:rPr>
         <w:lastRenderedPageBreak/>
         <w:drawing>
@@ -1078,6 +1108,7 @@
         <w:rPr>
           <w:b/>
           <w:bCs/>
+          <w:noProof/>
         </w:rPr>
         <w:drawing>
           <wp:inline distT="0" distB="0" distL="0" distR="0" wp14:anchorId="179DEFA6" wp14:editId="5C9749D7">
@@ -1127,6 +1158,7 @@
         <w:rPr>
           <w:b/>
           <w:bCs/>
+          <w:noProof/>
         </w:rPr>
         <w:drawing>
           <wp:inline distT="0" distB="0" distL="0" distR="0" wp14:anchorId="465A0BDC" wp14:editId="534DBDF4">
@@ -1168,6 +1200,7 @@
         <w:rPr>
           <w:b/>
           <w:bCs/>
+          <w:noProof/>
         </w:rPr>
         <w:drawing>
           <wp:inline distT="0" distB="0" distL="0" distR="0" wp14:anchorId="3B960465" wp14:editId="371DEB5A">
@@ -1232,6 +1265,7 @@
         <w:rPr>
           <w:b/>
           <w:bCs/>
+          <w:noProof/>
         </w:rPr>
         <w:drawing>
           <wp:inline distT="0" distB="0" distL="0" distR="0" wp14:anchorId="006C5987" wp14:editId="2027FFC2">
@@ -1273,6 +1307,7 @@
         <w:rPr>
           <w:b/>
           <w:bCs/>
+          <w:noProof/>
         </w:rPr>
         <w:drawing>
           <wp:inline distT="0" distB="0" distL="0" distR="0" wp14:anchorId="7837B942" wp14:editId="593B7BEA">
@@ -1314,6 +1349,7 @@
         <w:rPr>
           <w:b/>
           <w:bCs/>
+          <w:noProof/>
         </w:rPr>
         <w:drawing>
           <wp:inline distT="0" distB="0" distL="0" distR="0" wp14:anchorId="1F7019FA" wp14:editId="577E815B">
@@ -1365,6 +1401,1671 @@
           <w:bCs/>
         </w:rPr>
         <w:t xml:space="preserve">Then create the login template </w:t>
+      </w:r>
+    </w:p>
+    <w:p>
+      <w:pPr>
+        <w:rPr>
+          <w:b/>
+          <w:bCs/>
+        </w:rPr>
+      </w:pPr>
+      <w:r>
+        <w:rPr>
+          <w:b/>
+          <w:bCs/>
+        </w:rPr>
+        <w:t>After that I changed tasks/views.py</w:t>
+      </w:r>
+    </w:p>
+    <w:p>
+      <w:pPr>
+        <w:rPr>
+          <w:b/>
+          <w:bCs/>
+        </w:rPr>
+      </w:pPr>
+      <w:r>
+        <w:rPr>
+          <w:b/>
+          <w:bCs/>
+          <w:noProof/>
+        </w:rPr>
+        <w:lastRenderedPageBreak/>
+        <w:drawing>
+          <wp:inline distT="0" distB="0" distL="0" distR="0" wp14:anchorId="2E2C15F0" wp14:editId="6E1E53F2">
+            <wp:extent cx="2038350" cy="1610645"/>
+            <wp:effectExtent l="0" t="0" r="0" b="8890"/>
+            <wp:docPr id="66422226" name="Picture 1"/>
+            <wp:cNvGraphicFramePr>
+              <a:graphicFrameLocks xmlns:a="http://schemas.openxmlformats.org/drawingml/2006/main" noChangeAspect="1"/>
+            </wp:cNvGraphicFramePr>
+            <a:graphic xmlns:a="http://schemas.openxmlformats.org/drawingml/2006/main">
+              <a:graphicData uri="http://schemas.openxmlformats.org/drawingml/2006/picture">
+                <pic:pic xmlns:pic="http://schemas.openxmlformats.org/drawingml/2006/picture">
+                  <pic:nvPicPr>
+                    <pic:cNvPr id="66422226" name=""/>
+                    <pic:cNvPicPr/>
+                  </pic:nvPicPr>
+                  <pic:blipFill>
+                    <a:blip r:embed="rId32"/>
+                    <a:stretch>
+                      <a:fillRect/>
+                    </a:stretch>
+                  </pic:blipFill>
+                  <pic:spPr>
+                    <a:xfrm>
+                      <a:off x="0" y="0"/>
+                      <a:ext cx="2045674" cy="1616432"/>
+                    </a:xfrm>
+                    <a:prstGeom prst="rect">
+                      <a:avLst/>
+                    </a:prstGeom>
+                  </pic:spPr>
+                </pic:pic>
+              </a:graphicData>
+            </a:graphic>
+          </wp:inline>
+        </w:drawing>
+      </w:r>
+      <w:r>
+        <w:rPr>
+          <w:b/>
+          <w:bCs/>
+          <w:noProof/>
+        </w:rPr>
+        <w:drawing>
+          <wp:inline distT="0" distB="0" distL="0" distR="0" wp14:anchorId="2F0C4F64" wp14:editId="4412E908">
+            <wp:extent cx="1647825" cy="1776518"/>
+            <wp:effectExtent l="0" t="0" r="0" b="0"/>
+            <wp:docPr id="1636761348" name="Picture 1"/>
+            <wp:cNvGraphicFramePr>
+              <a:graphicFrameLocks xmlns:a="http://schemas.openxmlformats.org/drawingml/2006/main" noChangeAspect="1"/>
+            </wp:cNvGraphicFramePr>
+            <a:graphic xmlns:a="http://schemas.openxmlformats.org/drawingml/2006/main">
+              <a:graphicData uri="http://schemas.openxmlformats.org/drawingml/2006/picture">
+                <pic:pic xmlns:pic="http://schemas.openxmlformats.org/drawingml/2006/picture">
+                  <pic:nvPicPr>
+                    <pic:cNvPr id="1636761348" name=""/>
+                    <pic:cNvPicPr/>
+                  </pic:nvPicPr>
+                  <pic:blipFill>
+                    <a:blip r:embed="rId33"/>
+                    <a:stretch>
+                      <a:fillRect/>
+                    </a:stretch>
+                  </pic:blipFill>
+                  <pic:spPr>
+                    <a:xfrm>
+                      <a:off x="0" y="0"/>
+                      <a:ext cx="1657668" cy="1787130"/>
+                    </a:xfrm>
+                    <a:prstGeom prst="rect">
+                      <a:avLst/>
+                    </a:prstGeom>
+                  </pic:spPr>
+                </pic:pic>
+              </a:graphicData>
+            </a:graphic>
+          </wp:inline>
+        </w:drawing>
+      </w:r>
+      <w:r>
+        <w:rPr>
+          <w:b/>
+          <w:bCs/>
+          <w:noProof/>
+        </w:rPr>
+        <w:drawing>
+          <wp:inline distT="0" distB="0" distL="0" distR="0" wp14:anchorId="7D857A67" wp14:editId="31B1B37D">
+            <wp:extent cx="1702187" cy="1733550"/>
+            <wp:effectExtent l="0" t="0" r="0" b="0"/>
+            <wp:docPr id="788445174" name="Picture 1"/>
+            <wp:cNvGraphicFramePr>
+              <a:graphicFrameLocks xmlns:a="http://schemas.openxmlformats.org/drawingml/2006/main" noChangeAspect="1"/>
+            </wp:cNvGraphicFramePr>
+            <a:graphic xmlns:a="http://schemas.openxmlformats.org/drawingml/2006/main">
+              <a:graphicData uri="http://schemas.openxmlformats.org/drawingml/2006/picture">
+                <pic:pic xmlns:pic="http://schemas.openxmlformats.org/drawingml/2006/picture">
+                  <pic:nvPicPr>
+                    <pic:cNvPr id="788445174" name=""/>
+                    <pic:cNvPicPr/>
+                  </pic:nvPicPr>
+                  <pic:blipFill>
+                    <a:blip r:embed="rId34"/>
+                    <a:stretch>
+                      <a:fillRect/>
+                    </a:stretch>
+                  </pic:blipFill>
+                  <pic:spPr>
+                    <a:xfrm>
+                      <a:off x="0" y="0"/>
+                      <a:ext cx="1711819" cy="1743360"/>
+                    </a:xfrm>
+                    <a:prstGeom prst="rect">
+                      <a:avLst/>
+                    </a:prstGeom>
+                  </pic:spPr>
+                </pic:pic>
+              </a:graphicData>
+            </a:graphic>
+          </wp:inline>
+        </w:drawing>
+      </w:r>
+    </w:p>
+    <w:p>
+      <w:pPr>
+        <w:rPr>
+          <w:b/>
+          <w:bCs/>
+        </w:rPr>
+      </w:pPr>
+      <w:r>
+        <w:rPr>
+          <w:b/>
+          <w:bCs/>
+          <w:noProof/>
+        </w:rPr>
+        <w:drawing>
+          <wp:inline distT="0" distB="0" distL="0" distR="0" wp14:anchorId="41E72639" wp14:editId="608065A3">
+            <wp:extent cx="1714500" cy="1927334"/>
+            <wp:effectExtent l="0" t="0" r="0" b="0"/>
+            <wp:docPr id="1979817295" name="Picture 1"/>
+            <wp:cNvGraphicFramePr>
+              <a:graphicFrameLocks xmlns:a="http://schemas.openxmlformats.org/drawingml/2006/main" noChangeAspect="1"/>
+            </wp:cNvGraphicFramePr>
+            <a:graphic xmlns:a="http://schemas.openxmlformats.org/drawingml/2006/main">
+              <a:graphicData uri="http://schemas.openxmlformats.org/drawingml/2006/picture">
+                <pic:pic xmlns:pic="http://schemas.openxmlformats.org/drawingml/2006/picture">
+                  <pic:nvPicPr>
+                    <pic:cNvPr id="1979817295" name=""/>
+                    <pic:cNvPicPr/>
+                  </pic:nvPicPr>
+                  <pic:blipFill>
+                    <a:blip r:embed="rId35"/>
+                    <a:stretch>
+                      <a:fillRect/>
+                    </a:stretch>
+                  </pic:blipFill>
+                  <pic:spPr>
+                    <a:xfrm>
+                      <a:off x="0" y="0"/>
+                      <a:ext cx="1717118" cy="1930277"/>
+                    </a:xfrm>
+                    <a:prstGeom prst="rect">
+                      <a:avLst/>
+                    </a:prstGeom>
+                  </pic:spPr>
+                </pic:pic>
+              </a:graphicData>
+            </a:graphic>
+          </wp:inline>
+        </w:drawing>
+      </w:r>
+      <w:r>
+        <w:rPr>
+          <w:b/>
+          <w:bCs/>
+          <w:noProof/>
+        </w:rPr>
+        <w:drawing>
+          <wp:inline distT="0" distB="0" distL="0" distR="0" wp14:anchorId="7BB1F394" wp14:editId="6680C0E9">
+            <wp:extent cx="2133600" cy="1864165"/>
+            <wp:effectExtent l="0" t="0" r="0" b="3175"/>
+            <wp:docPr id="16916055" name="Picture 1"/>
+            <wp:cNvGraphicFramePr>
+              <a:graphicFrameLocks xmlns:a="http://schemas.openxmlformats.org/drawingml/2006/main" noChangeAspect="1"/>
+            </wp:cNvGraphicFramePr>
+            <a:graphic xmlns:a="http://schemas.openxmlformats.org/drawingml/2006/main">
+              <a:graphicData uri="http://schemas.openxmlformats.org/drawingml/2006/picture">
+                <pic:pic xmlns:pic="http://schemas.openxmlformats.org/drawingml/2006/picture">
+                  <pic:nvPicPr>
+                    <pic:cNvPr id="16916055" name=""/>
+                    <pic:cNvPicPr/>
+                  </pic:nvPicPr>
+                  <pic:blipFill>
+                    <a:blip r:embed="rId36"/>
+                    <a:stretch>
+                      <a:fillRect/>
+                    </a:stretch>
+                  </pic:blipFill>
+                  <pic:spPr>
+                    <a:xfrm>
+                      <a:off x="0" y="0"/>
+                      <a:ext cx="2144549" cy="1873731"/>
+                    </a:xfrm>
+                    <a:prstGeom prst="rect">
+                      <a:avLst/>
+                    </a:prstGeom>
+                  </pic:spPr>
+                </pic:pic>
+              </a:graphicData>
+            </a:graphic>
+          </wp:inline>
+        </w:drawing>
+      </w:r>
+    </w:p>
+    <w:p>
+      <w:pPr>
+        <w:rPr>
+          <w:b/>
+          <w:bCs/>
+        </w:rPr>
+      </w:pPr>
+      <w:r>
+        <w:rPr>
+          <w:b/>
+          <w:bCs/>
+        </w:rPr>
+        <w:t>Project list and detail page</w:t>
+      </w:r>
+    </w:p>
+    <w:p>
+      <w:pPr>
+        <w:rPr>
+          <w:b/>
+          <w:bCs/>
+        </w:rPr>
+      </w:pPr>
+      <w:r>
+        <w:rPr>
+          <w:b/>
+          <w:bCs/>
+          <w:noProof/>
+        </w:rPr>
+        <w:drawing>
+          <wp:inline distT="0" distB="0" distL="0" distR="0" wp14:anchorId="05234C2C" wp14:editId="1868F92C">
+            <wp:extent cx="1663491" cy="1943100"/>
+            <wp:effectExtent l="0" t="0" r="0" b="0"/>
+            <wp:docPr id="1653087679" name="Picture 1"/>
+            <wp:cNvGraphicFramePr>
+              <a:graphicFrameLocks xmlns:a="http://schemas.openxmlformats.org/drawingml/2006/main" noChangeAspect="1"/>
+            </wp:cNvGraphicFramePr>
+            <a:graphic xmlns:a="http://schemas.openxmlformats.org/drawingml/2006/main">
+              <a:graphicData uri="http://schemas.openxmlformats.org/drawingml/2006/picture">
+                <pic:pic xmlns:pic="http://schemas.openxmlformats.org/drawingml/2006/picture">
+                  <pic:nvPicPr>
+                    <pic:cNvPr id="1653087679" name=""/>
+                    <pic:cNvPicPr/>
+                  </pic:nvPicPr>
+                  <pic:blipFill>
+                    <a:blip r:embed="rId37"/>
+                    <a:stretch>
+                      <a:fillRect/>
+                    </a:stretch>
+                  </pic:blipFill>
+                  <pic:spPr>
+                    <a:xfrm>
+                      <a:off x="0" y="0"/>
+                      <a:ext cx="1673072" cy="1954292"/>
+                    </a:xfrm>
+                    <a:prstGeom prst="rect">
+                      <a:avLst/>
+                    </a:prstGeom>
+                  </pic:spPr>
+                </pic:pic>
+              </a:graphicData>
+            </a:graphic>
+          </wp:inline>
+        </w:drawing>
+      </w:r>
+      <w:r>
+        <w:rPr>
+          <w:b/>
+          <w:bCs/>
+          <w:noProof/>
+        </w:rPr>
+        <w:drawing>
+          <wp:inline distT="0" distB="0" distL="0" distR="0" wp14:anchorId="4C0FCE1E" wp14:editId="5BCB94D7">
+            <wp:extent cx="1638300" cy="1836720"/>
+            <wp:effectExtent l="0" t="0" r="0" b="0"/>
+            <wp:docPr id="1598800102" name="Picture 1"/>
+            <wp:cNvGraphicFramePr>
+              <a:graphicFrameLocks xmlns:a="http://schemas.openxmlformats.org/drawingml/2006/main" noChangeAspect="1"/>
+            </wp:cNvGraphicFramePr>
+            <a:graphic xmlns:a="http://schemas.openxmlformats.org/drawingml/2006/main">
+              <a:graphicData uri="http://schemas.openxmlformats.org/drawingml/2006/picture">
+                <pic:pic xmlns:pic="http://schemas.openxmlformats.org/drawingml/2006/picture">
+                  <pic:nvPicPr>
+                    <pic:cNvPr id="1598800102" name=""/>
+                    <pic:cNvPicPr/>
+                  </pic:nvPicPr>
+                  <pic:blipFill>
+                    <a:blip r:embed="rId38"/>
+                    <a:stretch>
+                      <a:fillRect/>
+                    </a:stretch>
+                  </pic:blipFill>
+                  <pic:spPr>
+                    <a:xfrm>
+                      <a:off x="0" y="0"/>
+                      <a:ext cx="1650201" cy="1850062"/>
+                    </a:xfrm>
+                    <a:prstGeom prst="rect">
+                      <a:avLst/>
+                    </a:prstGeom>
+                  </pic:spPr>
+                </pic:pic>
+              </a:graphicData>
+            </a:graphic>
+          </wp:inline>
+        </w:drawing>
+      </w:r>
+      <w:r>
+        <w:rPr>
+          <w:b/>
+          <w:bCs/>
+        </w:rPr>
+        <w:t xml:space="preserve">then create url file for projects </w:t>
+      </w:r>
+      <w:r>
+        <w:rPr>
+          <w:b/>
+          <w:bCs/>
+        </w:rPr>
+        <w:t xml:space="preserve">.and connect project urls to main config url also </w:t>
+      </w:r>
+    </w:p>
+    <w:p>
+      <w:pPr>
+        <w:rPr>
+          <w:b/>
+          <w:bCs/>
+        </w:rPr>
+      </w:pPr>
+      <w:r>
+        <w:rPr>
+          <w:b/>
+          <w:bCs/>
+        </w:rPr>
+        <w:t>Why we create TaskForm</w:t>
+      </w:r>
+    </w:p>
+    <w:p>
+      <w:r>
+        <w:t>Django needs a form object to:</w:t>
+      </w:r>
+    </w:p>
+    <w:p>
+      <w:pPr>
+        <w:pBdr>
+          <w:bottom w:val="single" w:sz="6" w:space="1" w:color="auto"/>
+        </w:pBdr>
+      </w:pPr>
+      <w:r>
+        <w:rPr>
+          <w:noProof/>
+        </w:rPr>
+        <w:lastRenderedPageBreak/>
+        <w:drawing>
+          <wp:inline distT="0" distB="0" distL="0" distR="0" wp14:anchorId="552D45E9" wp14:editId="26E5C16D">
+            <wp:extent cx="2021892" cy="2578100"/>
+            <wp:effectExtent l="0" t="0" r="0" b="0"/>
+            <wp:docPr id="287947992" name="Picture 1"/>
+            <wp:cNvGraphicFramePr>
+              <a:graphicFrameLocks xmlns:a="http://schemas.openxmlformats.org/drawingml/2006/main" noChangeAspect="1"/>
+            </wp:cNvGraphicFramePr>
+            <a:graphic xmlns:a="http://schemas.openxmlformats.org/drawingml/2006/main">
+              <a:graphicData uri="http://schemas.openxmlformats.org/drawingml/2006/picture">
+                <pic:pic xmlns:pic="http://schemas.openxmlformats.org/drawingml/2006/picture">
+                  <pic:nvPicPr>
+                    <pic:cNvPr id="287947992" name=""/>
+                    <pic:cNvPicPr/>
+                  </pic:nvPicPr>
+                  <pic:blipFill>
+                    <a:blip r:embed="rId39"/>
+                    <a:stretch>
+                      <a:fillRect/>
+                    </a:stretch>
+                  </pic:blipFill>
+                  <pic:spPr>
+                    <a:xfrm>
+                      <a:off x="0" y="0"/>
+                      <a:ext cx="2026388" cy="2583833"/>
+                    </a:xfrm>
+                    <a:prstGeom prst="rect">
+                      <a:avLst/>
+                    </a:prstGeom>
+                  </pic:spPr>
+                </pic:pic>
+              </a:graphicData>
+            </a:graphic>
+          </wp:inline>
+        </w:drawing>
+      </w:r>
+      <w:r>
+        <w:rPr>
+          <w:noProof/>
+        </w:rPr>
+        <w:drawing>
+          <wp:inline distT="0" distB="0" distL="0" distR="0" wp14:anchorId="39A64470" wp14:editId="690934F4">
+            <wp:extent cx="3238500" cy="2209861"/>
+            <wp:effectExtent l="0" t="0" r="0" b="0"/>
+            <wp:docPr id="1047243406" name="Picture 1"/>
+            <wp:cNvGraphicFramePr>
+              <a:graphicFrameLocks xmlns:a="http://schemas.openxmlformats.org/drawingml/2006/main" noChangeAspect="1"/>
+            </wp:cNvGraphicFramePr>
+            <a:graphic xmlns:a="http://schemas.openxmlformats.org/drawingml/2006/main">
+              <a:graphicData uri="http://schemas.openxmlformats.org/drawingml/2006/picture">
+                <pic:pic xmlns:pic="http://schemas.openxmlformats.org/drawingml/2006/picture">
+                  <pic:nvPicPr>
+                    <pic:cNvPr id="1047243406" name=""/>
+                    <pic:cNvPicPr/>
+                  </pic:nvPicPr>
+                  <pic:blipFill>
+                    <a:blip r:embed="rId40"/>
+                    <a:stretch>
+                      <a:fillRect/>
+                    </a:stretch>
+                  </pic:blipFill>
+                  <pic:spPr>
+                    <a:xfrm>
+                      <a:off x="0" y="0"/>
+                      <a:ext cx="3253631" cy="2220186"/>
+                    </a:xfrm>
+                    <a:prstGeom prst="rect">
+                      <a:avLst/>
+                    </a:prstGeom>
+                  </pic:spPr>
+                </pic:pic>
+              </a:graphicData>
+            </a:graphic>
+          </wp:inline>
+        </w:drawing>
+      </w:r>
+    </w:p>
+    <w:p>
+      <w:pPr>
+        <w:rPr>
+          <w:b/>
+          <w:bCs/>
+        </w:rPr>
+      </w:pPr>
+      <w:r>
+        <w:rPr>
+          <w:b/>
+          <w:bCs/>
+          <w:noProof/>
+        </w:rPr>
+        <w:drawing>
+          <wp:inline distT="0" distB="0" distL="0" distR="0" wp14:anchorId="27AEED0B" wp14:editId="3BF78D0A">
+            <wp:extent cx="1313693" cy="2095500"/>
+            <wp:effectExtent l="0" t="0" r="1270" b="0"/>
+            <wp:docPr id="1483344835" name="Picture 1"/>
+            <wp:cNvGraphicFramePr>
+              <a:graphicFrameLocks xmlns:a="http://schemas.openxmlformats.org/drawingml/2006/main" noChangeAspect="1"/>
+            </wp:cNvGraphicFramePr>
+            <a:graphic xmlns:a="http://schemas.openxmlformats.org/drawingml/2006/main">
+              <a:graphicData uri="http://schemas.openxmlformats.org/drawingml/2006/picture">
+                <pic:pic xmlns:pic="http://schemas.openxmlformats.org/drawingml/2006/picture">
+                  <pic:nvPicPr>
+                    <pic:cNvPr id="1483344835" name=""/>
+                    <pic:cNvPicPr/>
+                  </pic:nvPicPr>
+                  <pic:blipFill>
+                    <a:blip r:embed="rId41"/>
+                    <a:stretch>
+                      <a:fillRect/>
+                    </a:stretch>
+                  </pic:blipFill>
+                  <pic:spPr>
+                    <a:xfrm>
+                      <a:off x="0" y="0"/>
+                      <a:ext cx="1324281" cy="2112389"/>
+                    </a:xfrm>
+                    <a:prstGeom prst="rect">
+                      <a:avLst/>
+                    </a:prstGeom>
+                  </pic:spPr>
+                </pic:pic>
+              </a:graphicData>
+            </a:graphic>
+          </wp:inline>
+        </w:drawing>
+      </w:r>
+      <w:r>
+        <w:rPr>
+          <w:b/>
+          <w:bCs/>
+          <w:noProof/>
+        </w:rPr>
+        <w:drawing>
+          <wp:inline distT="0" distB="0" distL="0" distR="0" wp14:anchorId="52D18FB6" wp14:editId="6A76795B">
+            <wp:extent cx="1955800" cy="1983541"/>
+            <wp:effectExtent l="0" t="0" r="6350" b="0"/>
+            <wp:docPr id="431432357" name="Picture 1"/>
+            <wp:cNvGraphicFramePr>
+              <a:graphicFrameLocks xmlns:a="http://schemas.openxmlformats.org/drawingml/2006/main" noChangeAspect="1"/>
+            </wp:cNvGraphicFramePr>
+            <a:graphic xmlns:a="http://schemas.openxmlformats.org/drawingml/2006/main">
+              <a:graphicData uri="http://schemas.openxmlformats.org/drawingml/2006/picture">
+                <pic:pic xmlns:pic="http://schemas.openxmlformats.org/drawingml/2006/picture">
+                  <pic:nvPicPr>
+                    <pic:cNvPr id="431432357" name=""/>
+                    <pic:cNvPicPr/>
+                  </pic:nvPicPr>
+                  <pic:blipFill>
+                    <a:blip r:embed="rId42"/>
+                    <a:stretch>
+                      <a:fillRect/>
+                    </a:stretch>
+                  </pic:blipFill>
+                  <pic:spPr>
+                    <a:xfrm>
+                      <a:off x="0" y="0"/>
+                      <a:ext cx="1965956" cy="1993841"/>
+                    </a:xfrm>
+                    <a:prstGeom prst="rect">
+                      <a:avLst/>
+                    </a:prstGeom>
+                  </pic:spPr>
+                </pic:pic>
+              </a:graphicData>
+            </a:graphic>
+          </wp:inline>
+        </w:drawing>
+      </w:r>
+      <w:r>
+        <w:rPr>
+          <w:b/>
+          <w:bCs/>
+          <w:noProof/>
+        </w:rPr>
+        <w:drawing>
+          <wp:inline distT="0" distB="0" distL="0" distR="0" wp14:anchorId="06F46F54" wp14:editId="49DCF57C">
+            <wp:extent cx="2603500" cy="1829682"/>
+            <wp:effectExtent l="0" t="0" r="6350" b="0"/>
+            <wp:docPr id="1456474302" name="Picture 1"/>
+            <wp:cNvGraphicFramePr>
+              <a:graphicFrameLocks xmlns:a="http://schemas.openxmlformats.org/drawingml/2006/main" noChangeAspect="1"/>
+            </wp:cNvGraphicFramePr>
+            <a:graphic xmlns:a="http://schemas.openxmlformats.org/drawingml/2006/main">
+              <a:graphicData uri="http://schemas.openxmlformats.org/drawingml/2006/picture">
+                <pic:pic xmlns:pic="http://schemas.openxmlformats.org/drawingml/2006/picture">
+                  <pic:nvPicPr>
+                    <pic:cNvPr id="1456474302" name=""/>
+                    <pic:cNvPicPr/>
+                  </pic:nvPicPr>
+                  <pic:blipFill>
+                    <a:blip r:embed="rId43"/>
+                    <a:stretch>
+                      <a:fillRect/>
+                    </a:stretch>
+                  </pic:blipFill>
+                  <pic:spPr>
+                    <a:xfrm>
+                      <a:off x="0" y="0"/>
+                      <a:ext cx="2614266" cy="1837248"/>
+                    </a:xfrm>
+                    <a:prstGeom prst="rect">
+                      <a:avLst/>
+                    </a:prstGeom>
+                  </pic:spPr>
+                </pic:pic>
+              </a:graphicData>
+            </a:graphic>
+          </wp:inline>
+        </w:drawing>
+      </w:r>
+    </w:p>
+    <w:p>
+      <w:pPr>
+        <w:rPr>
+          <w:b/>
+          <w:bCs/>
+        </w:rPr>
+      </w:pPr>
+      <w:r>
+        <w:rPr>
+          <w:b/>
+          <w:bCs/>
+        </w:rPr>
+        <w:t xml:space="preserve">Update urls.py from tasks also </w:t>
+      </w:r>
+    </w:p>
+    <w:p>
+      <w:pPr>
+        <w:rPr>
+          <w:b/>
+          <w:bCs/>
+        </w:rPr>
+      </w:pPr>
+      <w:r>
+        <w:rPr>
+          <w:b/>
+          <w:bCs/>
+        </w:rPr>
+        <w:t xml:space="preserve">Then </w:t>
+      </w:r>
+      <w:r>
+        <w:rPr>
+          <w:b/>
+          <w:bCs/>
+        </w:rPr>
+        <w:t>Step 1 — templates/tasks/task_form.html</w:t>
+      </w:r>
+    </w:p>
+    <w:p>
+      <w:pPr>
+        <w:pBdr>
+          <w:bottom w:val="single" w:sz="6" w:space="1" w:color="auto"/>
+        </w:pBdr>
+        <w:rPr>
+          <w:b/>
+          <w:bCs/>
+        </w:rPr>
+      </w:pPr>
+      <w:r>
+        <w:rPr>
+          <w:b/>
+          <w:bCs/>
+          <w:noProof/>
+        </w:rPr>
+        <w:drawing>
+          <wp:inline distT="0" distB="0" distL="0" distR="0" wp14:anchorId="630E5315" wp14:editId="1D699C85">
+            <wp:extent cx="1714500" cy="1241001"/>
+            <wp:effectExtent l="0" t="0" r="0" b="0"/>
+            <wp:docPr id="711602069" name="Picture 1"/>
+            <wp:cNvGraphicFramePr>
+              <a:graphicFrameLocks xmlns:a="http://schemas.openxmlformats.org/drawingml/2006/main" noChangeAspect="1"/>
+            </wp:cNvGraphicFramePr>
+            <a:graphic xmlns:a="http://schemas.openxmlformats.org/drawingml/2006/main">
+              <a:graphicData uri="http://schemas.openxmlformats.org/drawingml/2006/picture">
+                <pic:pic xmlns:pic="http://schemas.openxmlformats.org/drawingml/2006/picture">
+                  <pic:nvPicPr>
+                    <pic:cNvPr id="711602069" name=""/>
+                    <pic:cNvPicPr/>
+                  </pic:nvPicPr>
+                  <pic:blipFill>
+                    <a:blip r:embed="rId44"/>
+                    <a:stretch>
+                      <a:fillRect/>
+                    </a:stretch>
+                  </pic:blipFill>
+                  <pic:spPr>
+                    <a:xfrm>
+                      <a:off x="0" y="0"/>
+                      <a:ext cx="1719983" cy="1244970"/>
+                    </a:xfrm>
+                    <a:prstGeom prst="rect">
+                      <a:avLst/>
+                    </a:prstGeom>
+                  </pic:spPr>
+                </pic:pic>
+              </a:graphicData>
+            </a:graphic>
+          </wp:inline>
+        </w:drawing>
+      </w:r>
+      <w:r>
+        <w:rPr>
+          <w:b/>
+          <w:bCs/>
+          <w:noProof/>
+        </w:rPr>
+        <w:drawing>
+          <wp:inline distT="0" distB="0" distL="0" distR="0" wp14:anchorId="3C64577A" wp14:editId="6E90FD36">
+            <wp:extent cx="1138577" cy="1276350"/>
+            <wp:effectExtent l="0" t="0" r="4445" b="0"/>
+            <wp:docPr id="366980066" name="Picture 1"/>
+            <wp:cNvGraphicFramePr>
+              <a:graphicFrameLocks xmlns:a="http://schemas.openxmlformats.org/drawingml/2006/main" noChangeAspect="1"/>
+            </wp:cNvGraphicFramePr>
+            <a:graphic xmlns:a="http://schemas.openxmlformats.org/drawingml/2006/main">
+              <a:graphicData uri="http://schemas.openxmlformats.org/drawingml/2006/picture">
+                <pic:pic xmlns:pic="http://schemas.openxmlformats.org/drawingml/2006/picture">
+                  <pic:nvPicPr>
+                    <pic:cNvPr id="366980066" name=""/>
+                    <pic:cNvPicPr/>
+                  </pic:nvPicPr>
+                  <pic:blipFill>
+                    <a:blip r:embed="rId45"/>
+                    <a:stretch>
+                      <a:fillRect/>
+                    </a:stretch>
+                  </pic:blipFill>
+                  <pic:spPr>
+                    <a:xfrm>
+                      <a:off x="0" y="0"/>
+                      <a:ext cx="1147957" cy="1286865"/>
+                    </a:xfrm>
+                    <a:prstGeom prst="rect">
+                      <a:avLst/>
+                    </a:prstGeom>
+                  </pic:spPr>
+                </pic:pic>
+              </a:graphicData>
+            </a:graphic>
+          </wp:inline>
+        </w:drawing>
+      </w:r>
+      <w:r>
+        <w:rPr>
+          <w:b/>
+          <w:bCs/>
+          <w:noProof/>
+        </w:rPr>
+        <w:drawing>
+          <wp:inline distT="0" distB="0" distL="0" distR="0" wp14:anchorId="5ABC3B10" wp14:editId="4F457C55">
+            <wp:extent cx="2962275" cy="778863"/>
+            <wp:effectExtent l="0" t="0" r="0" b="2540"/>
+            <wp:docPr id="1657258023" name="Picture 1"/>
+            <wp:cNvGraphicFramePr>
+              <a:graphicFrameLocks xmlns:a="http://schemas.openxmlformats.org/drawingml/2006/main" noChangeAspect="1"/>
+            </wp:cNvGraphicFramePr>
+            <a:graphic xmlns:a="http://schemas.openxmlformats.org/drawingml/2006/main">
+              <a:graphicData uri="http://schemas.openxmlformats.org/drawingml/2006/picture">
+                <pic:pic xmlns:pic="http://schemas.openxmlformats.org/drawingml/2006/picture">
+                  <pic:nvPicPr>
+                    <pic:cNvPr id="1657258023" name=""/>
+                    <pic:cNvPicPr/>
+                  </pic:nvPicPr>
+                  <pic:blipFill>
+                    <a:blip r:embed="rId46"/>
+                    <a:stretch>
+                      <a:fillRect/>
+                    </a:stretch>
+                  </pic:blipFill>
+                  <pic:spPr>
+                    <a:xfrm>
+                      <a:off x="0" y="0"/>
+                      <a:ext cx="2998320" cy="788340"/>
+                    </a:xfrm>
+                    <a:prstGeom prst="rect">
+                      <a:avLst/>
+                    </a:prstGeom>
+                  </pic:spPr>
+                </pic:pic>
+              </a:graphicData>
+            </a:graphic>
+          </wp:inline>
+        </w:drawing>
+      </w:r>
+    </w:p>
+    <w:p>
+      <w:pPr>
+        <w:pBdr>
+          <w:bottom w:val="single" w:sz="6" w:space="1" w:color="auto"/>
+        </w:pBdr>
+        <w:rPr>
+          <w:b/>
+          <w:bCs/>
+        </w:rPr>
+      </w:pPr>
+      <w:r>
+        <w:rPr>
+          <w:b/>
+          <w:bCs/>
+          <w:noProof/>
+        </w:rPr>
+        <w:lastRenderedPageBreak/>
+        <w:drawing>
+          <wp:inline distT="0" distB="0" distL="0" distR="0" wp14:anchorId="61E01E3C" wp14:editId="1BE96C2F">
+            <wp:extent cx="2712720" cy="2363486"/>
+            <wp:effectExtent l="0" t="0" r="0" b="0"/>
+            <wp:docPr id="994193684" name="Picture 1"/>
+            <wp:cNvGraphicFramePr>
+              <a:graphicFrameLocks xmlns:a="http://schemas.openxmlformats.org/drawingml/2006/main" noChangeAspect="1"/>
+            </wp:cNvGraphicFramePr>
+            <a:graphic xmlns:a="http://schemas.openxmlformats.org/drawingml/2006/main">
+              <a:graphicData uri="http://schemas.openxmlformats.org/drawingml/2006/picture">
+                <pic:pic xmlns:pic="http://schemas.openxmlformats.org/drawingml/2006/picture">
+                  <pic:nvPicPr>
+                    <pic:cNvPr id="994193684" name=""/>
+                    <pic:cNvPicPr/>
+                  </pic:nvPicPr>
+                  <pic:blipFill>
+                    <a:blip r:embed="rId47"/>
+                    <a:stretch>
+                      <a:fillRect/>
+                    </a:stretch>
+                  </pic:blipFill>
+                  <pic:spPr>
+                    <a:xfrm>
+                      <a:off x="0" y="0"/>
+                      <a:ext cx="2752876" cy="2398472"/>
+                    </a:xfrm>
+                    <a:prstGeom prst="rect">
+                      <a:avLst/>
+                    </a:prstGeom>
+                  </pic:spPr>
+                </pic:pic>
+              </a:graphicData>
+            </a:graphic>
+          </wp:inline>
+        </w:drawing>
+      </w:r>
+      <w:r>
+        <w:rPr>
+          <w:b/>
+          <w:bCs/>
+          <w:noProof/>
+        </w:rPr>
+        <w:drawing>
+          <wp:inline distT="0" distB="0" distL="0" distR="0" wp14:anchorId="03D288AA" wp14:editId="11ED59FE">
+            <wp:extent cx="2905125" cy="1013069"/>
+            <wp:effectExtent l="0" t="0" r="0" b="0"/>
+            <wp:docPr id="1172070513" name="Picture 1"/>
+            <wp:cNvGraphicFramePr>
+              <a:graphicFrameLocks xmlns:a="http://schemas.openxmlformats.org/drawingml/2006/main" noChangeAspect="1"/>
+            </wp:cNvGraphicFramePr>
+            <a:graphic xmlns:a="http://schemas.openxmlformats.org/drawingml/2006/main">
+              <a:graphicData uri="http://schemas.openxmlformats.org/drawingml/2006/picture">
+                <pic:pic xmlns:pic="http://schemas.openxmlformats.org/drawingml/2006/picture">
+                  <pic:nvPicPr>
+                    <pic:cNvPr id="1172070513" name=""/>
+                    <pic:cNvPicPr/>
+                  </pic:nvPicPr>
+                  <pic:blipFill>
+                    <a:blip r:embed="rId48"/>
+                    <a:stretch>
+                      <a:fillRect/>
+                    </a:stretch>
+                  </pic:blipFill>
+                  <pic:spPr>
+                    <a:xfrm>
+                      <a:off x="0" y="0"/>
+                      <a:ext cx="2926950" cy="1020680"/>
+                    </a:xfrm>
+                    <a:prstGeom prst="rect">
+                      <a:avLst/>
+                    </a:prstGeom>
+                  </pic:spPr>
+                </pic:pic>
+              </a:graphicData>
+            </a:graphic>
+          </wp:inline>
+        </w:drawing>
+      </w:r>
+    </w:p>
+    <w:p>
+      <w:pPr>
+        <w:pBdr>
+          <w:bottom w:val="single" w:sz="6" w:space="1" w:color="auto"/>
+        </w:pBdr>
+        <w:rPr>
+          <w:b/>
+          <w:bCs/>
+        </w:rPr>
+      </w:pPr>
+      <w:r>
+        <w:rPr>
+          <w:b/>
+          <w:bCs/>
+        </w:rPr>
+        <w:t>Step 2 — templates/tasks/task_confirm_delete.html</w:t>
+      </w:r>
+    </w:p>
+    <w:p>
+      <w:pPr>
+        <w:pBdr>
+          <w:bottom w:val="single" w:sz="6" w:space="1" w:color="auto"/>
+        </w:pBdr>
+        <w:rPr>
+          <w:b/>
+          <w:bCs/>
+        </w:rPr>
+      </w:pPr>
+      <w:r>
+        <w:rPr>
+          <w:b/>
+          <w:bCs/>
+          <w:noProof/>
+        </w:rPr>
+        <w:drawing>
+          <wp:inline distT="0" distB="0" distL="0" distR="0" wp14:anchorId="7933CFBC" wp14:editId="5BC3C024">
+            <wp:extent cx="2524125" cy="1279052"/>
+            <wp:effectExtent l="0" t="0" r="0" b="0"/>
+            <wp:docPr id="1309883719" name="Picture 1"/>
+            <wp:cNvGraphicFramePr>
+              <a:graphicFrameLocks xmlns:a="http://schemas.openxmlformats.org/drawingml/2006/main" noChangeAspect="1"/>
+            </wp:cNvGraphicFramePr>
+            <a:graphic xmlns:a="http://schemas.openxmlformats.org/drawingml/2006/main">
+              <a:graphicData uri="http://schemas.openxmlformats.org/drawingml/2006/picture">
+                <pic:pic xmlns:pic="http://schemas.openxmlformats.org/drawingml/2006/picture">
+                  <pic:nvPicPr>
+                    <pic:cNvPr id="1309883719" name=""/>
+                    <pic:cNvPicPr/>
+                  </pic:nvPicPr>
+                  <pic:blipFill>
+                    <a:blip r:embed="rId49"/>
+                    <a:stretch>
+                      <a:fillRect/>
+                    </a:stretch>
+                  </pic:blipFill>
+                  <pic:spPr>
+                    <a:xfrm>
+                      <a:off x="0" y="0"/>
+                      <a:ext cx="2633929" cy="1334693"/>
+                    </a:xfrm>
+                    <a:prstGeom prst="rect">
+                      <a:avLst/>
+                    </a:prstGeom>
+                  </pic:spPr>
+                </pic:pic>
+              </a:graphicData>
+            </a:graphic>
+          </wp:inline>
+        </w:drawing>
+      </w:r>
+    </w:p>
+    <w:p>
+      <w:pPr>
+        <w:pBdr>
+          <w:bottom w:val="single" w:sz="6" w:space="1" w:color="auto"/>
+        </w:pBdr>
+        <w:rPr>
+          <w:b/>
+          <w:bCs/>
+        </w:rPr>
+      </w:pPr>
+      <w:r>
+        <w:rPr>
+          <w:b/>
+          <w:bCs/>
+        </w:rPr>
+        <w:t>Step 3 — Add links in dashboard to test edit/delete</w:t>
+      </w:r>
+    </w:p>
+    <w:p>
+      <w:pPr>
+        <w:pBdr>
+          <w:bottom w:val="single" w:sz="6" w:space="1" w:color="auto"/>
+        </w:pBdr>
+        <w:rPr>
+          <w:b/>
+          <w:bCs/>
+        </w:rPr>
+      </w:pPr>
+      <w:r>
+        <w:rPr>
+          <w:b/>
+          <w:bCs/>
+          <w:noProof/>
+        </w:rPr>
+        <w:drawing>
+          <wp:inline distT="0" distB="0" distL="0" distR="0" wp14:anchorId="49EFE23B" wp14:editId="0AB9F5C8">
+            <wp:extent cx="2305050" cy="819327"/>
+            <wp:effectExtent l="0" t="0" r="0" b="0"/>
+            <wp:docPr id="1562742713" name="Picture 1"/>
+            <wp:cNvGraphicFramePr>
+              <a:graphicFrameLocks xmlns:a="http://schemas.openxmlformats.org/drawingml/2006/main" noChangeAspect="1"/>
+            </wp:cNvGraphicFramePr>
+            <a:graphic xmlns:a="http://schemas.openxmlformats.org/drawingml/2006/main">
+              <a:graphicData uri="http://schemas.openxmlformats.org/drawingml/2006/picture">
+                <pic:pic xmlns:pic="http://schemas.openxmlformats.org/drawingml/2006/picture">
+                  <pic:nvPicPr>
+                    <pic:cNvPr id="1562742713" name=""/>
+                    <pic:cNvPicPr/>
+                  </pic:nvPicPr>
+                  <pic:blipFill>
+                    <a:blip r:embed="rId50"/>
+                    <a:stretch>
+                      <a:fillRect/>
+                    </a:stretch>
+                  </pic:blipFill>
+                  <pic:spPr>
+                    <a:xfrm>
+                      <a:off x="0" y="0"/>
+                      <a:ext cx="2338941" cy="831374"/>
+                    </a:xfrm>
+                    <a:prstGeom prst="rect">
+                      <a:avLst/>
+                    </a:prstGeom>
+                  </pic:spPr>
+                </pic:pic>
+              </a:graphicData>
+            </a:graphic>
+          </wp:inline>
+        </w:drawing>
+      </w:r>
+    </w:p>
+    <w:p>
+      <w:pPr>
+        <w:pBdr>
+          <w:bottom w:val="single" w:sz="6" w:space="1" w:color="auto"/>
+        </w:pBdr>
+        <w:rPr>
+          <w:b/>
+          <w:bCs/>
+        </w:rPr>
+      </w:pPr>
+      <w:r>
+        <w:rPr>
+          <w:b/>
+          <w:bCs/>
+        </w:rPr>
+        <w:t xml:space="preserve">Answer to how taskform knows which fields to include in task is because of model form </w:t>
+      </w:r>
+    </w:p>
+    <w:p>
+      <w:pPr>
+        <w:pBdr>
+          <w:bottom w:val="single" w:sz="6" w:space="1" w:color="auto"/>
+        </w:pBdr>
+        <w:rPr>
+          <w:b/>
+          <w:bCs/>
+        </w:rPr>
+      </w:pPr>
+      <w:r>
+        <w:rPr>
+          <w:b/>
+          <w:bCs/>
+          <w:noProof/>
+        </w:rPr>
+        <w:drawing>
+          <wp:inline distT="0" distB="0" distL="0" distR="0" wp14:anchorId="30D3291D" wp14:editId="20B70422">
+            <wp:extent cx="2079091" cy="1314450"/>
+            <wp:effectExtent l="0" t="0" r="0" b="0"/>
+            <wp:docPr id="1672634150" name="Picture 1"/>
+            <wp:cNvGraphicFramePr>
+              <a:graphicFrameLocks xmlns:a="http://schemas.openxmlformats.org/drawingml/2006/main" noChangeAspect="1"/>
+            </wp:cNvGraphicFramePr>
+            <a:graphic xmlns:a="http://schemas.openxmlformats.org/drawingml/2006/main">
+              <a:graphicData uri="http://schemas.openxmlformats.org/drawingml/2006/picture">
+                <pic:pic xmlns:pic="http://schemas.openxmlformats.org/drawingml/2006/picture">
+                  <pic:nvPicPr>
+                    <pic:cNvPr id="1672634150" name=""/>
+                    <pic:cNvPicPr/>
+                  </pic:nvPicPr>
+                  <pic:blipFill>
+                    <a:blip r:embed="rId51"/>
+                    <a:stretch>
+                      <a:fillRect/>
+                    </a:stretch>
+                  </pic:blipFill>
+                  <pic:spPr>
+                    <a:xfrm>
+                      <a:off x="0" y="0"/>
+                      <a:ext cx="2087106" cy="1319518"/>
+                    </a:xfrm>
+                    <a:prstGeom prst="rect">
+                      <a:avLst/>
+                    </a:prstGeom>
+                  </pic:spPr>
+                </pic:pic>
+              </a:graphicData>
+            </a:graphic>
+          </wp:inline>
+        </w:drawing>
+      </w:r>
+      <w:r>
+        <w:rPr>
+          <w:b/>
+          <w:bCs/>
+          <w:noProof/>
+        </w:rPr>
+        <w:drawing>
+          <wp:inline distT="0" distB="0" distL="0" distR="0" wp14:anchorId="5AC34306" wp14:editId="1EEBFD40">
+            <wp:extent cx="1466850" cy="1876909"/>
+            <wp:effectExtent l="0" t="0" r="0" b="9525"/>
+            <wp:docPr id="1655874829" name="Picture 1"/>
+            <wp:cNvGraphicFramePr>
+              <a:graphicFrameLocks xmlns:a="http://schemas.openxmlformats.org/drawingml/2006/main" noChangeAspect="1"/>
+            </wp:cNvGraphicFramePr>
+            <a:graphic xmlns:a="http://schemas.openxmlformats.org/drawingml/2006/main">
+              <a:graphicData uri="http://schemas.openxmlformats.org/drawingml/2006/picture">
+                <pic:pic xmlns:pic="http://schemas.openxmlformats.org/drawingml/2006/picture">
+                  <pic:nvPicPr>
+                    <pic:cNvPr id="1655874829" name=""/>
+                    <pic:cNvPicPr/>
+                  </pic:nvPicPr>
+                  <pic:blipFill>
+                    <a:blip r:embed="rId52"/>
+                    <a:stretch>
+                      <a:fillRect/>
+                    </a:stretch>
+                  </pic:blipFill>
+                  <pic:spPr>
+                    <a:xfrm>
+                      <a:off x="0" y="0"/>
+                      <a:ext cx="1483446" cy="1898144"/>
+                    </a:xfrm>
+                    <a:prstGeom prst="rect">
+                      <a:avLst/>
+                    </a:prstGeom>
+                  </pic:spPr>
+                </pic:pic>
+              </a:graphicData>
+            </a:graphic>
+          </wp:inline>
+        </w:drawing>
+      </w:r>
+      <w:r>
+        <w:rPr>
+          <w:b/>
+          <w:bCs/>
+          <w:noProof/>
+        </w:rPr>
+        <w:drawing>
+          <wp:inline distT="0" distB="0" distL="0" distR="0" wp14:anchorId="16D5E057" wp14:editId="441692E6">
+            <wp:extent cx="2232078" cy="1152525"/>
+            <wp:effectExtent l="0" t="0" r="0" b="0"/>
+            <wp:docPr id="1680464259" name="Picture 1"/>
+            <wp:cNvGraphicFramePr>
+              <a:graphicFrameLocks xmlns:a="http://schemas.openxmlformats.org/drawingml/2006/main" noChangeAspect="1"/>
+            </wp:cNvGraphicFramePr>
+            <a:graphic xmlns:a="http://schemas.openxmlformats.org/drawingml/2006/main">
+              <a:graphicData uri="http://schemas.openxmlformats.org/drawingml/2006/picture">
+                <pic:pic xmlns:pic="http://schemas.openxmlformats.org/drawingml/2006/picture">
+                  <pic:nvPicPr>
+                    <pic:cNvPr id="1680464259" name=""/>
+                    <pic:cNvPicPr/>
+                  </pic:nvPicPr>
+                  <pic:blipFill>
+                    <a:blip r:embed="rId53"/>
+                    <a:stretch>
+                      <a:fillRect/>
+                    </a:stretch>
+                  </pic:blipFill>
+                  <pic:spPr>
+                    <a:xfrm>
+                      <a:off x="0" y="0"/>
+                      <a:ext cx="2238198" cy="1155685"/>
+                    </a:xfrm>
+                    <a:prstGeom prst="rect">
+                      <a:avLst/>
+                    </a:prstGeom>
+                  </pic:spPr>
+                </pic:pic>
+              </a:graphicData>
+            </a:graphic>
+          </wp:inline>
+        </w:drawing>
+      </w:r>
+    </w:p>
+    <w:p>
+      <w:pPr>
+        <w:rPr>
+          <w:b/>
+          <w:bCs/>
+        </w:rPr>
+      </w:pPr>
+      <w:r>
+        <w:rPr>
+          <w:b/>
+          <w:bCs/>
+        </w:rPr>
+        <w:t>Then add tasks/forms the comment form and then in views add a task_detail view</w:t>
+      </w:r>
+    </w:p>
+    <w:p>
+      <w:pPr>
+        <w:rPr>
+          <w:noProof/>
+        </w:rPr>
+      </w:pPr>
+      <w:r>
+        <w:rPr>
+          <w:b/>
+          <w:bCs/>
+        </w:rPr>
+        <w:lastRenderedPageBreak/>
+        <w:drawing>
+          <wp:inline distT="0" distB="0" distL="0" distR="0" wp14:anchorId="0DEED456" wp14:editId="17B53B40">
+            <wp:extent cx="1876425" cy="1627839"/>
+            <wp:effectExtent l="0" t="0" r="0" b="0"/>
+            <wp:docPr id="1184989220" name="Picture 1"/>
+            <wp:cNvGraphicFramePr>
+              <a:graphicFrameLocks xmlns:a="http://schemas.openxmlformats.org/drawingml/2006/main" noChangeAspect="1"/>
+            </wp:cNvGraphicFramePr>
+            <a:graphic xmlns:a="http://schemas.openxmlformats.org/drawingml/2006/main">
+              <a:graphicData uri="http://schemas.openxmlformats.org/drawingml/2006/picture">
+                <pic:pic xmlns:pic="http://schemas.openxmlformats.org/drawingml/2006/picture">
+                  <pic:nvPicPr>
+                    <pic:cNvPr id="1184989220" name=""/>
+                    <pic:cNvPicPr/>
+                  </pic:nvPicPr>
+                  <pic:blipFill>
+                    <a:blip r:embed="rId54"/>
+                    <a:stretch>
+                      <a:fillRect/>
+                    </a:stretch>
+                  </pic:blipFill>
+                  <pic:spPr>
+                    <a:xfrm>
+                      <a:off x="0" y="0"/>
+                      <a:ext cx="1889330" cy="1639034"/>
+                    </a:xfrm>
+                    <a:prstGeom prst="rect">
+                      <a:avLst/>
+                    </a:prstGeom>
+                  </pic:spPr>
+                </pic:pic>
+              </a:graphicData>
+            </a:graphic>
+          </wp:inline>
+        </w:drawing>
+      </w:r>
+      <w:r>
+        <w:rPr>
+          <w:noProof/>
+        </w:rPr>
+        <w:t xml:space="preserve"> </w:t>
+      </w:r>
+      <w:r>
+        <w:rPr>
+          <w:b/>
+          <w:bCs/>
+        </w:rPr>
+        <w:drawing>
+          <wp:inline distT="0" distB="0" distL="0" distR="0" wp14:anchorId="320039D1" wp14:editId="210ACBEF">
+            <wp:extent cx="1303020" cy="2008952"/>
+            <wp:effectExtent l="0" t="0" r="0" b="0"/>
+            <wp:docPr id="410763069" name="Picture 1"/>
+            <wp:cNvGraphicFramePr>
+              <a:graphicFrameLocks xmlns:a="http://schemas.openxmlformats.org/drawingml/2006/main" noChangeAspect="1"/>
+            </wp:cNvGraphicFramePr>
+            <a:graphic xmlns:a="http://schemas.openxmlformats.org/drawingml/2006/main">
+              <a:graphicData uri="http://schemas.openxmlformats.org/drawingml/2006/picture">
+                <pic:pic xmlns:pic="http://schemas.openxmlformats.org/drawingml/2006/picture">
+                  <pic:nvPicPr>
+                    <pic:cNvPr id="410763069" name=""/>
+                    <pic:cNvPicPr/>
+                  </pic:nvPicPr>
+                  <pic:blipFill>
+                    <a:blip r:embed="rId55"/>
+                    <a:stretch>
+                      <a:fillRect/>
+                    </a:stretch>
+                  </pic:blipFill>
+                  <pic:spPr>
+                    <a:xfrm>
+                      <a:off x="0" y="0"/>
+                      <a:ext cx="1314241" cy="2026252"/>
+                    </a:xfrm>
+                    <a:prstGeom prst="rect">
+                      <a:avLst/>
+                    </a:prstGeom>
+                  </pic:spPr>
+                </pic:pic>
+              </a:graphicData>
+            </a:graphic>
+          </wp:inline>
+        </w:drawing>
+      </w:r>
+      <w:r>
+        <w:rPr>
+          <w:noProof/>
+        </w:rPr>
+        <w:t xml:space="preserve"> </w:t>
+      </w:r>
+      <w:r>
+        <w:rPr>
+          <w:noProof/>
+        </w:rPr>
+        <w:drawing>
+          <wp:inline distT="0" distB="0" distL="0" distR="0" wp14:anchorId="2CB2EDEE" wp14:editId="1487352D">
+            <wp:extent cx="1752600" cy="1867193"/>
+            <wp:effectExtent l="0" t="0" r="0" b="0"/>
+            <wp:docPr id="468452710" name="Picture 1"/>
+            <wp:cNvGraphicFramePr>
+              <a:graphicFrameLocks xmlns:a="http://schemas.openxmlformats.org/drawingml/2006/main" noChangeAspect="1"/>
+            </wp:cNvGraphicFramePr>
+            <a:graphic xmlns:a="http://schemas.openxmlformats.org/drawingml/2006/main">
+              <a:graphicData uri="http://schemas.openxmlformats.org/drawingml/2006/picture">
+                <pic:pic xmlns:pic="http://schemas.openxmlformats.org/drawingml/2006/picture">
+                  <pic:nvPicPr>
+                    <pic:cNvPr id="468452710" name=""/>
+                    <pic:cNvPicPr/>
+                  </pic:nvPicPr>
+                  <pic:blipFill>
+                    <a:blip r:embed="rId56"/>
+                    <a:stretch>
+                      <a:fillRect/>
+                    </a:stretch>
+                  </pic:blipFill>
+                  <pic:spPr>
+                    <a:xfrm>
+                      <a:off x="0" y="0"/>
+                      <a:ext cx="1759046" cy="1874060"/>
+                    </a:xfrm>
+                    <a:prstGeom prst="rect">
+                      <a:avLst/>
+                    </a:prstGeom>
+                  </pic:spPr>
+                </pic:pic>
+              </a:graphicData>
+            </a:graphic>
+          </wp:inline>
+        </w:drawing>
+      </w:r>
+    </w:p>
+    <w:p>
+      <w:pPr>
+        <w:rPr>
+          <w:b/>
+          <w:bCs/>
+        </w:rPr>
+      </w:pPr>
+      <w:r>
+        <w:rPr>
+          <w:b/>
+          <w:bCs/>
+        </w:rPr>
+        <w:drawing>
+          <wp:inline distT="0" distB="0" distL="0" distR="0" wp14:anchorId="2F7D3764" wp14:editId="62BD76C6">
+            <wp:extent cx="1285875" cy="1521792"/>
+            <wp:effectExtent l="0" t="0" r="0" b="2540"/>
+            <wp:docPr id="1871931010" name="Picture 1"/>
+            <wp:cNvGraphicFramePr>
+              <a:graphicFrameLocks xmlns:a="http://schemas.openxmlformats.org/drawingml/2006/main" noChangeAspect="1"/>
+            </wp:cNvGraphicFramePr>
+            <a:graphic xmlns:a="http://schemas.openxmlformats.org/drawingml/2006/main">
+              <a:graphicData uri="http://schemas.openxmlformats.org/drawingml/2006/picture">
+                <pic:pic xmlns:pic="http://schemas.openxmlformats.org/drawingml/2006/picture">
+                  <pic:nvPicPr>
+                    <pic:cNvPr id="1871931010" name=""/>
+                    <pic:cNvPicPr/>
+                  </pic:nvPicPr>
+                  <pic:blipFill>
+                    <a:blip r:embed="rId57"/>
+                    <a:stretch>
+                      <a:fillRect/>
+                    </a:stretch>
+                  </pic:blipFill>
+                  <pic:spPr>
+                    <a:xfrm>
+                      <a:off x="0" y="0"/>
+                      <a:ext cx="1293206" cy="1530468"/>
+                    </a:xfrm>
+                    <a:prstGeom prst="rect">
+                      <a:avLst/>
+                    </a:prstGeom>
+                  </pic:spPr>
+                </pic:pic>
+              </a:graphicData>
+            </a:graphic>
+          </wp:inline>
+        </w:drawing>
+      </w:r>
+      <w:r>
+        <w:rPr>
+          <w:b/>
+          <w:bCs/>
+        </w:rPr>
+        <w:t xml:space="preserve">then add a url for task detail and then add task_detail.html and add a detail link from dashboard.html  </w:t>
+      </w:r>
+      <w:r>
+        <w:rPr>
+          <w:b/>
+          <w:bCs/>
+        </w:rPr>
+        <w:t>&lt;a href="{% url 'task_detail' task.pk %}"&gt;{{ task.title }}&lt;/a&gt;</w:t>
+      </w:r>
+    </w:p>
+    <w:p>
+      <w:pPr>
+        <w:rPr>
+          <w:b/>
+          <w:bCs/>
+        </w:rPr>
+      </w:pPr>
+      <w:r>
+        <w:rPr>
+          <w:b/>
+          <w:bCs/>
+        </w:rPr>
+        <w:t>Then we did some modification like in manager dashboard it should look different and employee should be diff  and now project deletion handeling  in projects/views.py</w:t>
+      </w:r>
+    </w:p>
+    <w:p>
+      <w:pPr>
+        <w:rPr>
+          <w:noProof/>
+        </w:rPr>
+      </w:pPr>
+      <w:r>
+        <w:rPr>
+          <w:b/>
+          <w:bCs/>
+        </w:rPr>
+        <w:drawing>
+          <wp:inline distT="0" distB="0" distL="0" distR="0" wp14:anchorId="3C34400B" wp14:editId="1BF0CEC4">
+            <wp:extent cx="1562100" cy="2239118"/>
+            <wp:effectExtent l="0" t="0" r="0" b="8890"/>
+            <wp:docPr id="670660001" name="Picture 1"/>
+            <wp:cNvGraphicFramePr>
+              <a:graphicFrameLocks xmlns:a="http://schemas.openxmlformats.org/drawingml/2006/main" noChangeAspect="1"/>
+            </wp:cNvGraphicFramePr>
+            <a:graphic xmlns:a="http://schemas.openxmlformats.org/drawingml/2006/main">
+              <a:graphicData uri="http://schemas.openxmlformats.org/drawingml/2006/picture">
+                <pic:pic xmlns:pic="http://schemas.openxmlformats.org/drawingml/2006/picture">
+                  <pic:nvPicPr>
+                    <pic:cNvPr id="670660001" name=""/>
+                    <pic:cNvPicPr/>
+                  </pic:nvPicPr>
+                  <pic:blipFill>
+                    <a:blip r:embed="rId58"/>
+                    <a:stretch>
+                      <a:fillRect/>
+                    </a:stretch>
+                  </pic:blipFill>
+                  <pic:spPr>
+                    <a:xfrm>
+                      <a:off x="0" y="0"/>
+                      <a:ext cx="1574910" cy="2257480"/>
+                    </a:xfrm>
+                    <a:prstGeom prst="rect">
+                      <a:avLst/>
+                    </a:prstGeom>
+                  </pic:spPr>
+                </pic:pic>
+              </a:graphicData>
+            </a:graphic>
+          </wp:inline>
+        </w:drawing>
+      </w:r>
+      <w:r>
+        <w:rPr>
+          <w:noProof/>
+        </w:rPr>
+        <w:t xml:space="preserve"> </w:t>
+      </w:r>
+      <w:r>
+        <w:rPr>
+          <w:b/>
+          <w:bCs/>
+        </w:rPr>
+        <w:drawing>
+          <wp:inline distT="0" distB="0" distL="0" distR="0" wp14:anchorId="08A81F4C" wp14:editId="6612EC15">
+            <wp:extent cx="2257425" cy="1866958"/>
+            <wp:effectExtent l="0" t="0" r="0" b="0"/>
+            <wp:docPr id="927169632" name="Picture 1"/>
+            <wp:cNvGraphicFramePr>
+              <a:graphicFrameLocks xmlns:a="http://schemas.openxmlformats.org/drawingml/2006/main" noChangeAspect="1"/>
+            </wp:cNvGraphicFramePr>
+            <a:graphic xmlns:a="http://schemas.openxmlformats.org/drawingml/2006/main">
+              <a:graphicData uri="http://schemas.openxmlformats.org/drawingml/2006/picture">
+                <pic:pic xmlns:pic="http://schemas.openxmlformats.org/drawingml/2006/picture">
+                  <pic:nvPicPr>
+                    <pic:cNvPr id="927169632" name=""/>
+                    <pic:cNvPicPr/>
+                  </pic:nvPicPr>
+                  <pic:blipFill>
+                    <a:blip r:embed="rId59"/>
+                    <a:stretch>
+                      <a:fillRect/>
+                    </a:stretch>
+                  </pic:blipFill>
+                  <pic:spPr>
+                    <a:xfrm>
+                      <a:off x="0" y="0"/>
+                      <a:ext cx="2259565" cy="1868728"/>
+                    </a:xfrm>
+                    <a:prstGeom prst="rect">
+                      <a:avLst/>
+                    </a:prstGeom>
+                  </pic:spPr>
+                </pic:pic>
+              </a:graphicData>
+            </a:graphic>
+          </wp:inline>
+        </w:drawing>
+      </w:r>
+    </w:p>
+    <w:p>
+      <w:pPr>
+        <w:rPr>
+          <w:noProof/>
+        </w:rPr>
+      </w:pPr>
+      <w:r>
+        <w:rPr>
+          <w:noProof/>
+        </w:rPr>
+        <w:t xml:space="preserve">Then added permissions for tasks views all of them </w:t>
+      </w:r>
+    </w:p>
+    <w:p>
+      <w:pPr>
+        <w:rPr>
+          <w:noProof/>
+        </w:rPr>
+      </w:pPr>
+      <w:r>
+        <w:rPr>
+          <w:noProof/>
+        </w:rPr>
+        <w:t xml:space="preserve">Now only manager can delete the tasks not the employee </w:t>
+      </w:r>
+    </w:p>
+    <w:p>
+      <w:pPr>
+        <w:rPr>
+          <w:b/>
+          <w:bCs/>
+        </w:rPr>
+      </w:pPr>
+      <w:r>
+        <w:rPr>
+          <w:b/>
+          <w:bCs/>
+        </w:rPr>
+        <w:t xml:space="preserve">Then add the base html to show all the things dashboard login logout etc </w:t>
+      </w:r>
+    </w:p>
+    <w:p>
+      <w:pPr>
+        <w:rPr>
+          <w:b/>
+          <w:bCs/>
+        </w:rPr>
+      </w:pPr>
+      <w:r>
+        <w:rPr>
+          <w:b/>
+          <w:bCs/>
+        </w:rPr>
+        <w:t>Base.html</w:t>
+      </w:r>
+    </w:p>
+    <w:p>
+      <w:pPr>
+        <w:rPr>
+          <w:b/>
+          <w:bCs/>
+        </w:rPr>
+      </w:pPr>
+      <w:r>
+        <w:rPr>
+          <w:b/>
+          <w:bCs/>
+        </w:rPr>
+        <w:lastRenderedPageBreak/>
+        <w:drawing>
+          <wp:inline distT="0" distB="0" distL="0" distR="0" wp14:anchorId="49052BEC" wp14:editId="3A840967">
+            <wp:extent cx="2142383" cy="1838325"/>
+            <wp:effectExtent l="0" t="0" r="0" b="0"/>
+            <wp:docPr id="1681106005" name="Picture 1"/>
+            <wp:cNvGraphicFramePr>
+              <a:graphicFrameLocks xmlns:a="http://schemas.openxmlformats.org/drawingml/2006/main" noChangeAspect="1"/>
+            </wp:cNvGraphicFramePr>
+            <a:graphic xmlns:a="http://schemas.openxmlformats.org/drawingml/2006/main">
+              <a:graphicData uri="http://schemas.openxmlformats.org/drawingml/2006/picture">
+                <pic:pic xmlns:pic="http://schemas.openxmlformats.org/drawingml/2006/picture">
+                  <pic:nvPicPr>
+                    <pic:cNvPr id="1681106005" name=""/>
+                    <pic:cNvPicPr/>
+                  </pic:nvPicPr>
+                  <pic:blipFill>
+                    <a:blip r:embed="rId60"/>
+                    <a:stretch>
+                      <a:fillRect/>
+                    </a:stretch>
+                  </pic:blipFill>
+                  <pic:spPr>
+                    <a:xfrm>
+                      <a:off x="0" y="0"/>
+                      <a:ext cx="2148945" cy="1843955"/>
+                    </a:xfrm>
+                    <a:prstGeom prst="rect">
+                      <a:avLst/>
+                    </a:prstGeom>
+                  </pic:spPr>
+                </pic:pic>
+              </a:graphicData>
+            </a:graphic>
+          </wp:inline>
+        </w:drawing>
+      </w:r>
+      <w:r>
+        <w:rPr>
+          <w:b/>
+          <w:bCs/>
+        </w:rPr>
+        <w:br/>
+        <w:t xml:space="preserve">then add extends base.html in all the templates </w:t>
+      </w:r>
+    </w:p>
+    <w:p>
+      <w:pPr>
+        <w:rPr>
+          <w:b/>
+          <w:bCs/>
+        </w:rPr>
+      </w:pPr>
+      <w:r>
+        <w:rPr>
+          <w:b/>
+          <w:bCs/>
+        </w:rPr>
+        <w:drawing>
+          <wp:inline distT="0" distB="0" distL="0" distR="0" wp14:anchorId="19CA2F93" wp14:editId="35076CAE">
+            <wp:extent cx="2657475" cy="1409267"/>
+            <wp:effectExtent l="0" t="0" r="0" b="635"/>
+            <wp:docPr id="1599106003" name="Picture 1"/>
+            <wp:cNvGraphicFramePr>
+              <a:graphicFrameLocks xmlns:a="http://schemas.openxmlformats.org/drawingml/2006/main" noChangeAspect="1"/>
+            </wp:cNvGraphicFramePr>
+            <a:graphic xmlns:a="http://schemas.openxmlformats.org/drawingml/2006/main">
+              <a:graphicData uri="http://schemas.openxmlformats.org/drawingml/2006/picture">
+                <pic:pic xmlns:pic="http://schemas.openxmlformats.org/drawingml/2006/picture">
+                  <pic:nvPicPr>
+                    <pic:cNvPr id="1599106003" name=""/>
+                    <pic:cNvPicPr/>
+                  </pic:nvPicPr>
+                  <pic:blipFill>
+                    <a:blip r:embed="rId61"/>
+                    <a:stretch>
+                      <a:fillRect/>
+                    </a:stretch>
+                  </pic:blipFill>
+                  <pic:spPr>
+                    <a:xfrm>
+                      <a:off x="0" y="0"/>
+                      <a:ext cx="2676755" cy="1419491"/>
+                    </a:xfrm>
+                    <a:prstGeom prst="rect">
+                      <a:avLst/>
+                    </a:prstGeom>
+                  </pic:spPr>
+                </pic:pic>
+              </a:graphicData>
+            </a:graphic>
+          </wp:inline>
+        </w:drawing>
       </w:r>
     </w:p>
     <w:p>
@@ -2302,6 +4003,36 @@
       <w:spacing w:val="5"/>
     </w:rPr>
   </w:style>
+  <w:style w:type="paragraph" w:styleId="HTMLPreformatted">
+    <w:name w:val="HTML Preformatted"/>
+    <w:basedOn w:val="Normal"/>
+    <w:link w:val="HTMLPreformattedChar"/>
+    <w:uiPriority w:val="99"/>
+    <w:semiHidden/>
+    <w:unhideWhenUsed/>
+    <w:rsid w:val="000A59DC"/>
+    <w:pPr>
+      <w:spacing w:after="0" w:line="240" w:lineRule="auto"/>
+    </w:pPr>
+    <w:rPr>
+      <w:rFonts w:ascii="Consolas" w:hAnsi="Consolas"/>
+      <w:sz w:val="20"/>
+      <w:szCs w:val="20"/>
+    </w:rPr>
+  </w:style>
+  <w:style w:type="character" w:customStyle="1" w:styleId="HTMLPreformattedChar">
+    <w:name w:val="HTML Preformatted Char"/>
+    <w:basedOn w:val="DefaultParagraphFont"/>
+    <w:link w:val="HTMLPreformatted"/>
+    <w:uiPriority w:val="99"/>
+    <w:semiHidden/>
+    <w:rsid w:val="000A59DC"/>
+    <w:rPr>
+      <w:rFonts w:ascii="Consolas" w:hAnsi="Consolas"/>
+      <w:sz w:val="20"/>
+      <w:szCs w:val="20"/>
+    </w:rPr>
+  </w:style>
 </w:styles>
 </file>
 

</xml_diff>